<commit_message>
Master Delivery Map v2: secuencia combinada, estado de plataforma, Coverage Matrix y tracks
Co-Authored-By: Claude Opus 5.5 <noreply@anthropic.com>
Claude-Session: https://claude.ai/code/session_01PSmnUj1LvutfXzpzQBGsxa
</commit_message>
<xml_diff>
--- a/onboarding/recursos/Master_Delivery_Map_20_sesiones.docx
+++ b/onboarding/recursos/Master_Delivery_Map_20_sesiones.docx
@@ -69,6 +69,17 @@
           <w:i w:val="0"/>
         </w:rPr>
         <w:t>Cada alumna tiene una sesión 1:1 por semana: 20 sesiones en total. La sesión 1 es su onboarding, las sesiones 2–19 recorren el método completo y la sesión 20 es el offboarding.</w:t>
+      </w:r>
+    </w:p>
+    <w:p>
+      <w:r>
+        <w:rPr>
+          <w:b/>
+          <w:i w:val="0"/>
+          <w:color w:val="81552E"/>
+          <w:sz w:val="20"/>
+        </w:rPr>
+        <w:t>Principio: THE PATH IS STRUCTURED. THE INTERVENTION IS PERSONALIZED.</w:t>
       </w:r>
     </w:p>
     <w:p>
@@ -267,7 +278,7 @@
                 <w:color w:val="81552E"/>
                 <w:sz w:val="20"/>
               </w:rPr>
-              <w:t>3 · Microenseñanza (5–10 min)</w:t>
+              <w:t>3 · Diagnóstico</w:t>
             </w:r>
           </w:p>
         </w:tc>
@@ -282,7 +293,7 @@
                 <w:i w:val="0"/>
                 <w:sz w:val="20"/>
               </w:rPr>
-              <w:t>Solo si no vio la clase de la plataforma o si el primer intento muestra que no la incorporó. Si ya la vio: una pregunta de chequeo y directo a la aplicación.</w:t>
+              <w:t>Un solo gap prioritario: comunicación, lenguaje disponible, precisión, pronunciación o listening.</w:t>
             </w:r>
           </w:p>
         </w:tc>
@@ -301,7 +312,41 @@
                 <w:color w:val="81552E"/>
                 <w:sz w:val="20"/>
               </w:rPr>
-              <w:t>4 · Aplicación a su situación real</w:t>
+              <w:t>4 · Microenseñanza (5–10 min)</w:t>
+            </w:r>
+          </w:p>
+        </w:tc>
+        <w:tc>
+          <w:tcPr>
+            <w:tcW w:type="dxa" w:w="6576"/>
+          </w:tcPr>
+          <w:p>
+            <w:r>
+              <w:rPr>
+                <w:b w:val="0"/>
+                <w:i w:val="0"/>
+                <w:sz w:val="20"/>
+              </w:rPr>
+              <w:t>Si no vio la clase de la plataforma, si todavía no está disponible o si el primer intento muestra que no la incorporó. Si ya la vio: una pregunta de chequeo y directo a la aplicación.</w:t>
+            </w:r>
+          </w:p>
+        </w:tc>
+      </w:tr>
+      <w:tr>
+        <w:tc>
+          <w:tcPr>
+            <w:tcW w:type="dxa" w:w="2835"/>
+            <w:shd w:val="clear" w:color="auto" w:fill="FBF2D0"/>
+          </w:tcPr>
+          <w:p>
+            <w:r>
+              <w:rPr>
+                <w:b/>
+                <w:i w:val="0"/>
+                <w:color w:val="81552E"/>
+                <w:sz w:val="20"/>
+              </w:rPr>
+              <w:t>5 · Aplicación a su situación real</w:t>
             </w:r>
           </w:p>
         </w:tc>
@@ -335,7 +380,7 @@
                 <w:color w:val="81552E"/>
                 <w:sz w:val="20"/>
               </w:rPr>
-              <w:t>5 · Retry + presión</w:t>
+              <w:t>6 · Retry + presión</w:t>
             </w:r>
           </w:p>
         </w:tc>
@@ -369,7 +414,7 @@
                 <w:color w:val="81552E"/>
                 <w:sz w:val="20"/>
               </w:rPr>
-              <w:t>6 · Cierre</w:t>
+              <w:t>7 · Cierre</w:t>
             </w:r>
           </w:p>
         </w:tc>
@@ -403,7 +448,7 @@
                 <w:color w:val="81552E"/>
                 <w:sz w:val="20"/>
               </w:rPr>
-              <w:t>7 · Next step</w:t>
+              <w:t>8 · Next step</w:t>
             </w:r>
           </w:p>
         </w:tc>
@@ -900,7 +945,7 @@
                 <w:i w:val="0"/>
                 <w:sz w:val="20"/>
               </w:rPr>
-              <w:t>Instalar su sistema de trabajo y fijar su punto de partida.</w:t>
+              <w:t>Instalar su sistema de trabajo, fijar su punto de partida y definir su objetivo.</w:t>
             </w:r>
           </w:p>
         </w:tc>
@@ -919,7 +964,7 @@
                 <w:color w:val="81552E"/>
                 <w:sz w:val="19"/>
               </w:rPr>
-              <w:t>Apoyo en plataforma</w:t>
+              <w:t>En la plataforma</w:t>
             </w:r>
           </w:p>
         </w:tc>
@@ -934,7 +979,7 @@
                 <w:i w:val="0"/>
                 <w:sz w:val="20"/>
               </w:rPr>
-              <w:t>ONB 01–13 + recurso «Tu recorrido AT WORK».</w:t>
+              <w:t>ONB 01–13 (casi todo listo) · Recurso «Tu recorrido AT WORK» (listo)</w:t>
             </w:r>
           </w:p>
         </w:tc>
@@ -968,7 +1013,7 @@
                 <w:i w:val="0"/>
                 <w:sz w:val="20"/>
               </w:rPr>
-              <w:t>Sabe cómo funciona AT WORK, tiene su Starting Point revisado, un foco inicial definido en una frase y su primera situación real elegida.</w:t>
+              <w:t>Termina la sesión con el sistema configurado, su Starting Point revisado, un objetivo profesional observable y 2–3 situaciones reales de alto impacto elegidas.</w:t>
             </w:r>
           </w:p>
         </w:tc>
@@ -1002,7 +1047,7 @@
                 <w:i w:val="0"/>
                 <w:sz w:val="20"/>
               </w:rPr>
-              <w:t>Starting Point completo (autoevaluación + audio o video espontáneo de 2–3 min) · checklist de ONB 13 completo · foco inicial escrito · horario 1:1 agendado.</w:t>
+              <w:t>Starting Point completo (autoevaluación + audio o video de 2–3 min) · objetivo escrito en una frase · lista de 2–3 situaciones reales · horario 1:1 agendado.</w:t>
             </w:r>
           </w:p>
         </w:tc>
@@ -1043,7 +1088,7 @@
           <w:color w:val="C68C6C"/>
           <w:sz w:val="17"/>
         </w:rPr>
-        <w:t>MICROENSEÑANZA · 5–10 MIN (SI NO VIO LA PLATAFORMA)</w:t>
+        <w:t>MICROENSEÑANZA · 5–10 MIN · SI NO VIO LA CLASE</w:t>
       </w:r>
     </w:p>
     <w:p>
@@ -1059,7 +1104,7 @@
         <w:pStyle w:val="ListBullet"/>
       </w:pPr>
       <w:r>
-        <w:t>El ciclo de cada semana: situación real → producir → feedback → retry → evidencia.</w:t>
+        <w:t>El ciclo de cada semana: situación real → producir → diagnóstico → entrenar → retry → aplicar.</w:t>
       </w:r>
     </w:p>
     <w:p>
@@ -1090,7 +1135,7 @@
           <w:b w:val="0"/>
           <w:i w:val="0"/>
         </w:rPr>
-        <w:t>Escuchan juntas un fragmento de su audio del Starting Point. Detectas 1–2 patrones de alto impacto y, a partir de eso, definen el foco inicial. Después eligen la situación real que va a traer a la sesión 2. Ej.: Belén, el onboarding de un proveedor nuevo; Sol, el status de su proyecto; Virginia, el update al CEO.</w:t>
+        <w:t>Escuchan juntas un fragmento de su audio del Starting Point y detectas los primeros patrones (comunicación, precisión, pronunciación, listening). Con eso definen su objetivo en conducta observable y eligen las situaciones que serán su campo de entrenamiento. Ej.: Belén, el onboarding de un proveedor nuevo; Sol, el status de su proyecto; Virginia, el update al CEO.</w:t>
       </w:r>
     </w:p>
     <w:p>
@@ -1136,7 +1181,7 @@
           <w:b w:val="0"/>
           <w:i w:val="0"/>
         </w:rPr>
-        <w:t>Completar lo que falte del checklist de ONB 13, subir 3–5 materiales reales, reservar sus bloques de práctica, ver M1.1–M1.3 y enviar su primer Weekly Report.</w:t>
+        <w:t>Completar lo que falte del checklist de ONB 13, subir 3–5 materiales reales, reservar sus bloques de práctica y traer una situación real para la sesión 2.</w:t>
       </w:r>
     </w:p>
     <w:p>
@@ -1160,7 +1205,7 @@
           <w:i/>
           <w:color w:val="8A6A55"/>
         </w:rPr>
-        <w:t>En esta sesión todavía no se enseña inglés: es instalación. Si todo el checklist está completo, dedica más tiempo al audio del Starting Point.</w:t>
+        <w:t>En esta sesión todavía no se enseña contenido del Módulo 1: se instala el sistema y se deja el punto de partida medible.</w:t>
       </w:r>
     </w:p>
     <w:p>
@@ -1188,7 +1233,7 @@
           <w:color w:val="81552E"/>
           <w:sz w:val="40"/>
         </w:rPr>
-        <w:t>Situación real → producir primero</w:t>
+        <w:t>Produce First · Role Play</w:t>
       </w:r>
     </w:p>
     <w:tbl>
@@ -1238,7 +1283,7 @@
                 <w:i w:val="0"/>
                 <w:sz w:val="20"/>
               </w:rPr>
-              <w:t>Convertir una situación real de su trabajo en práctica y producir antes de preparar (Role Play Method).</w:t>
+              <w:t>Convertir una situación real en práctica y producir antes de preparar una respuesta perfecta.</w:t>
             </w:r>
           </w:p>
         </w:tc>
@@ -1257,7 +1302,7 @@
                 <w:color w:val="81552E"/>
                 <w:sz w:val="19"/>
               </w:rPr>
-              <w:t>Apoyo en plataforma</w:t>
+              <w:t>En la plataforma</w:t>
             </w:r>
           </w:p>
         </w:tc>
@@ -1272,7 +1317,7 @@
                 <w:i w:val="0"/>
                 <w:sz w:val="20"/>
               </w:rPr>
-              <w:t>M1.1 My Professional Context · M1.2 Practice System · M1.3 Role Play Method · M1.7 Bots.</w:t>
+              <w:t>M1.1 My Professional Context (en desarrollo) · M1.2 Your AT WORK Practice System (en desarrollo) · M1.3 Role Play Method (grabada) · M1.7 Acceso y configuración de bots (en desarrollo)</w:t>
             </w:r>
           </w:p>
         </w:tc>
@@ -1306,7 +1351,7 @@
                 <w:i w:val="0"/>
                 <w:sz w:val="20"/>
               </w:rPr>
-              <w:t>Arma un role play a partir de una situación real y habla antes de prepararse.</w:t>
+              <w:t>Produce una primera versión espontánea de una situación real, sin guion, y sabe repetirla con un bot entre sesiones.</w:t>
             </w:r>
           </w:p>
         </w:tc>
@@ -1340,7 +1385,7 @@
                 <w:i w:val="0"/>
                 <w:sz w:val="20"/>
               </w:rPr>
-              <w:t>Role play grabado (intento 1 + retry) sobre su situación real · lista de 3–5 situaciones recurrentes de su trabajo en 01 · MI CONTEXTO PROFESIONAL.</w:t>
+              <w:t>Role play grabado sin guion (versión 1 + retry) · puede decir qué le salió fácil y dónde apareció fricción.</w:t>
             </w:r>
           </w:p>
         </w:tc>
@@ -1367,7 +1412,7 @@
           <w:i/>
           <w:color w:val="8A6A55"/>
         </w:rPr>
-        <w:t>«Estamos en Activate Your English. Hoy el foco es convertir tu situación real en práctica. Al terminar, vas a poder practicar tu propio trabajo entre sesiones, con o sin bot.»</w:t>
+        <w:t>«Estamos en Activate Your English. Hoy el foco es producir primero, antes de preparar. Al terminar, vas a poder practicar tu propio trabajo entre sesiones, con o sin bot.»</w:t>
       </w:r>
     </w:p>
     <w:p>
@@ -1381,7 +1426,7 @@
           <w:color w:val="C68C6C"/>
           <w:sz w:val="17"/>
         </w:rPr>
-        <w:t>MICROENSEÑANZA · 5–10 MIN (SI NO VIO LA PLATAFORMA)</w:t>
+        <w:t>MICROENSEÑANZA · 5–10 MIN · OBLIGATORIA SI LA CLASE TODAVÍA NO ESTÁ DISPONIBLE</w:t>
       </w:r>
     </w:p>
     <w:p>
@@ -1389,7 +1434,7 @@
         <w:pStyle w:val="ListBullet"/>
       </w:pPr>
       <w:r>
-        <w:t>Por qué producir primero: el inglés que ya tienes se activa usándolo, no repasándolo.</w:t>
+        <w:t>Por qué producir primero: el inglés que ya tienes se activa usándolo, no repasándolo. Preparar no es lo mismo que poder hacerlo en el momento.</w:t>
       </w:r>
     </w:p>
     <w:p>
@@ -1397,7 +1442,7 @@
         <w:pStyle w:val="ListBullet"/>
       </w:pPr>
       <w:r>
-        <w:t>Cómo se arma un role play: quién es el interlocutor, qué necesita, qué quieres lograr, 2–3 minutos.</w:t>
+        <w:t>Cómo se arma un role play: contexto, interlocutor, propósito y presión. 2–3 minutos.</w:t>
       </w:r>
     </w:p>
     <w:p>
@@ -1405,7 +1450,15 @@
         <w:pStyle w:val="ListBullet"/>
       </w:pPr>
       <w:r>
-        <w:t>Cómo usar los bots para repetir esa situación entre sesiones.</w:t>
+        <w:t>El ciclo AT WORK: Real Situation → Produce → Analyze → Upgrade → Practice → Retry → Apply.</w:t>
+      </w:r>
+    </w:p>
+    <w:p>
+      <w:pPr>
+        <w:pStyle w:val="ListBullet"/>
+      </w:pPr>
+      <w:r>
+        <w:t>Cómo usar los bots para repetir esa situación.</w:t>
       </w:r>
     </w:p>
     <w:p>
@@ -1451,7 +1504,7 @@
           <w:b w:val="0"/>
           <w:i w:val="0"/>
         </w:rPr>
-        <w:t>Mismo role play con un solo ajuste del feedback. Presión: el interlocutor hace una pregunta inesperada.</w:t>
+        <w:t>Mismo role play con un solo ajuste. Presión: el interlocutor hace una pregunta inesperada.</w:t>
       </w:r>
     </w:p>
     <w:p>
@@ -1474,7 +1527,7 @@
           <w:b w:val="0"/>
           <w:i w:val="0"/>
         </w:rPr>
-        <w:t>Dos role plays con bot sobre situaciones de su lista, audios guardados en 04 · MIS PRÁCTICAS. Weekly Report.</w:t>
+        <w:t>Repetir con bot un role play de una situación próxima y guardar la primera versión + observaciones en 04 · MIS PRÁCTICAS.</w:t>
       </w:r>
     </w:p>
     <w:p>
@@ -1498,7 +1551,7 @@
           <w:i/>
           <w:color w:val="8A6A55"/>
         </w:rPr>
-        <w:t>Sube la presión: interlocutor con más poder, menos tiempo o una situación que evita.</w:t>
+        <w:t>Sube la presión: un interlocutor con más poder, menos tiempo o una situación que evita.</w:t>
       </w:r>
     </w:p>
     <w:p>
@@ -1526,7 +1579,7 @@
           <w:color w:val="81552E"/>
           <w:sz w:val="40"/>
         </w:rPr>
-        <w:t>Narrative Flow</w:t>
+        <w:t>Narrative Flow · corregir lo que revela tu inglés real</w:t>
       </w:r>
     </w:p>
     <w:tbl>
@@ -1576,7 +1629,7 @@
                 <w:i w:val="0"/>
                 <w:sz w:val="20"/>
               </w:rPr>
-              <w:t>Contar una situación de trabajo con un hilo claro, sin frases sueltas.</w:t>
+              <w:t>Convertir su producción espontánea en diagnóstico: autocorregirse y elegir pocos focos.</w:t>
             </w:r>
           </w:p>
         </w:tc>
@@ -1595,7 +1648,7 @@
                 <w:color w:val="81552E"/>
                 <w:sz w:val="19"/>
               </w:rPr>
-              <w:t>Apoyo en plataforma</w:t>
+              <w:t>En la plataforma</w:t>
             </w:r>
           </w:p>
         </w:tc>
@@ -1610,7 +1663,7 @@
                 <w:i w:val="0"/>
                 <w:sz w:val="20"/>
               </w:rPr>
-              <w:t>M1.4 Narrative Flow.</w:t>
+              <w:t>M1.4 Narrative Flow (grabada)</w:t>
             </w:r>
           </w:p>
         </w:tc>
@@ -1644,7 +1697,7 @@
                 <w:i w:val="0"/>
                 <w:sz w:val="20"/>
               </w:rPr>
-              <w:t>Cuenta qué pasó o qué está pasando en su trabajo con inicio, desarrollo y cierre, conectando las ideas.</w:t>
+              <w:t>Revisa una producción propia, se autocorrige antes de recibir corrección y sale con un Error Radar de 1–3 focos.</w:t>
             </w:r>
           </w:p>
         </w:tc>
@@ -1678,7 +1731,7 @@
                 <w:i w:val="0"/>
                 <w:sz w:val="20"/>
               </w:rPr>
-              <w:t>Audio de 1–2 min narrando una situación real con secuencia clara y conectores · comparación intento 1 vs retry.</w:t>
+              <w:t>Corrige parte de su producción sin que le des la respuesta primero · Error Radar escrito y priorizado.</w:t>
             </w:r>
           </w:p>
         </w:tc>
@@ -1705,7 +1758,7 @@
           <w:i/>
           <w:color w:val="8A6A55"/>
         </w:rPr>
-        <w:t>«Estamos en Activate Your English. Hoy el foco es contar lo que pasa en tu trabajo con un hilo claro. Al terminar, vas a poder contar una situación de principio a fin sin perderte.»</w:t>
+        <w:t>«Estamos en Activate Your English. Hoy el foco es aprender de tu propia producción. Al terminar, vas a poder detectar tus errores y saber cuáles importan.»</w:t>
       </w:r>
     </w:p>
     <w:p>
@@ -1719,7 +1772,7 @@
           <w:color w:val="C68C6C"/>
           <w:sz w:val="17"/>
         </w:rPr>
-        <w:t>MICROENSEÑANZA · 5–10 MIN (SI NO VIO LA PLATAFORMA)</w:t>
+        <w:t>MICROENSEÑANZA · 5–10 MIN · SI NO VIO LA CLASE</w:t>
       </w:r>
     </w:p>
     <w:p>
@@ -1727,7 +1780,7 @@
         <w:pStyle w:val="ListBullet"/>
       </w:pPr>
       <w:r>
-        <w:t>Estructura: contexto → qué pasó → qué hiciste o qué se decidió → resultado o próximo paso.</w:t>
+        <w:t>Narrative Flow: volver a una producción real y revisarla manteniendo lo que quisiste decir.</w:t>
       </w:r>
     </w:p>
     <w:p>
@@ -1735,7 +1788,7 @@
         <w:pStyle w:val="ListBullet"/>
       </w:pPr>
       <w:r>
-        <w:t>Conectores: first, then, after that, because, so, in the end.</w:t>
+        <w:t>Autocorrección primero, corrección externa después.</w:t>
       </w:r>
     </w:p>
     <w:p>
@@ -1743,7 +1796,15 @@
         <w:pStyle w:val="ListBullet"/>
       </w:pPr>
       <w:r>
-        <w:t>Pasado para lo que ocurrió, presente para cómo están las cosas hoy.</w:t>
+        <w:t>Error recurrente vs. error aislado: se corrige lo que se repite y lo que interfiere con la claridad.</w:t>
+      </w:r>
+    </w:p>
+    <w:p>
+      <w:pPr>
+        <w:pStyle w:val="ListBullet"/>
+      </w:pPr>
+      <w:r>
+        <w:t>Error Radar: máximo 1–3 focos a vigilar.</w:t>
       </w:r>
     </w:p>
     <w:p>
@@ -1766,7 +1827,7 @@
           <w:b w:val="0"/>
           <w:i w:val="0"/>
         </w:rPr>
-        <w:t>Cuenta lo que pasó esta semana. Belén: cómo fue el primer contacto con el proveedor. Sol: qué cambió en el proyecto desde el último update. Virginia: la semana de su equipo en 90 segundos.</w:t>
+        <w:t>Toma la grabación de la sesión 2 (o un audio de la semana) y la revisa contigo. Belén: lo que dijo al proveedor. Sol: su status. Virginia: su update.</w:t>
       </w:r>
     </w:p>
     <w:p>
@@ -1789,7 +1850,7 @@
           <w:b w:val="0"/>
           <w:i w:val="0"/>
         </w:rPr>
-        <w:t>La misma historia en menos tiempo (de 2 minutos a 90 segundos). Presión: la interrumpes con «Wait, why did that happen?» y retoma el hilo.</w:t>
+        <w:t>Vuelve a producir la misma situación atenta solo a su Error Radar.</w:t>
       </w:r>
     </w:p>
     <w:p>
@@ -1812,7 +1873,7 @@
           <w:b w:val="0"/>
           <w:i w:val="0"/>
         </w:rPr>
-        <w:t>Narrar una situación de trabajo por día en un audio de 1 minuto (o con bot). Weekly Report.</w:t>
+        <w:t>Aplicar el Error Radar a otra producción breve y traer un ejemplo de autocorrección.</w:t>
       </w:r>
     </w:p>
     <w:p>
@@ -1836,7 +1897,7 @@
           <w:i/>
           <w:color w:val="8A6A55"/>
         </w:rPr>
-        <w:t>Pasa a narrar un problema: qué lo causó y qué consecuencias tuvo.</w:t>
+        <w:t>Que haga la revisión sola y tú solo validas la prioridad.</w:t>
       </w:r>
     </w:p>
     <w:p>
@@ -1864,7 +1925,7 @@
           <w:color w:val="81552E"/>
           <w:sz w:val="40"/>
         </w:rPr>
-        <w:t>Color Method + ciclo completo</w:t>
+        <w:t>Color Method + retry · ciclo completo</w:t>
       </w:r>
     </w:p>
     <w:tbl>
@@ -1914,7 +1975,7 @@
                 <w:i w:val="0"/>
                 <w:sz w:val="20"/>
               </w:rPr>
-              <w:t>Cerrar el ciclo completo: producir → analizar → mejorar → practicar → retry → aplicar.</w:t>
+              <w:t>Expandir el lenguaje que realmente puede recuperar y cerrar el primer ciclo completo con un retry observable.</w:t>
             </w:r>
           </w:p>
         </w:tc>
@@ -1933,7 +1994,7 @@
                 <w:color w:val="81552E"/>
                 <w:sz w:val="19"/>
               </w:rPr>
-              <w:t>Apoyo en plataforma</w:t>
+              <w:t>En la plataforma</w:t>
             </w:r>
           </w:p>
         </w:tc>
@@ -1948,7 +2009,7 @@
                 <w:i w:val="0"/>
                 <w:sz w:val="20"/>
               </w:rPr>
-              <w:t>M1.5 Color Method · M1.6 Complete Practice Cycle / Retry.</w:t>
+              <w:t>M1.5 Color Method (grabada) · M1.6 Your Complete Practice Cycle / Retry (en desarrollo)</w:t>
             </w:r>
           </w:p>
         </w:tc>
@@ -1982,7 +2043,7 @@
                 <w:i w:val="0"/>
                 <w:sz w:val="20"/>
               </w:rPr>
-              <w:t>Revisa su propia producción, identifica el lenguaje que le faltó y lo recupera en el retry sin mirar notas.</w:t>
+              <w:t>Mejora una segunda versión de su situación real, sin memorizar un guion, usando su Error Radar y 2–3 piezas de lenguaje nuevo.</w:t>
             </w:r>
           </w:p>
         </w:tc>
@@ -2016,7 +2077,7 @@
                 <w:i w:val="0"/>
                 <w:sz w:val="20"/>
               </w:rPr>
-              <w:t>Producción original + retry con al menos una mejora visible · lenguaje nuevo registrado con Color Method · primer ciclo completo guardado en 04 · MIS PRÁCTICAS.</w:t>
+              <w:t>Versión 1 vs retry con al menos una mejora concreta que ella misma puede nombrar · 2–3 piezas de Active Language registradas.</w:t>
             </w:r>
           </w:p>
         </w:tc>
@@ -2091,7 +2152,7 @@
           <w:color w:val="C68C6C"/>
           <w:sz w:val="17"/>
         </w:rPr>
-        <w:t>MICROENSEÑANZA · 5–10 MIN (SI NO VIO LA PLATAFORMA)</w:t>
+        <w:t>MICROENSEÑANZA · 5–10 MIN · OBLIGATORIA SI LA CLASE TODAVÍA NO ESTÁ DISPONIBLE</w:t>
       </w:r>
     </w:p>
     <w:p>
@@ -2099,7 +2160,7 @@
         <w:pStyle w:val="ListBullet"/>
       </w:pPr>
       <w:r>
-        <w:t>Color Method: marcar el lenguaje relevante para pasarlo de reconocerlo a recuperarlo y usarlo (con los colores de la clase M1.5).</w:t>
+        <w:t>Color Method: explorar lenguaje útil a partir de tu mensaje real, no coleccionar vocabulario. Pasarlo de reconocerlo a recuperarlo y usarlo.</w:t>
       </w:r>
     </w:p>
     <w:p>
@@ -2107,7 +2168,7 @@
         <w:pStyle w:val="ListBullet"/>
       </w:pPr>
       <w:r>
-        <w:t>El ciclo completo del Módulo 1, de punta a punta.</w:t>
+        <w:t>Elegir 2–3 piezas de Active Language que mejoren claridad, precisión o impacto, y practicarlas en más de una frase.</w:t>
       </w:r>
     </w:p>
     <w:p>
@@ -2115,7 +2176,7 @@
         <w:pStyle w:val="ListBullet"/>
       </w:pPr>
       <w:r>
-        <w:t>Qué es un buen retry: la misma tarea, una mejora concreta y sin leer.</w:t>
+        <w:t>Retry: volver a la misma situación con Error Radar + Active Language y comparar.</w:t>
       </w:r>
     </w:p>
     <w:p>
@@ -2138,7 +2199,7 @@
           <w:b w:val="0"/>
           <w:i w:val="0"/>
         </w:rPr>
-        <w:t>Retoma la situación de las sesiones 2–3 para poder comparar. Graba, marca con Color Method el lenguaje que necesitaba y hace el retry.</w:t>
+        <w:t>Retoma la situación de las sesiones 2–3 para poder comparar. Elige su Active Language, lo practica y hace el retry.</w:t>
       </w:r>
     </w:p>
     <w:p>
@@ -2184,7 +2245,7 @@
           <w:b w:val="0"/>
           <w:i w:val="0"/>
         </w:rPr>
-        <w:t>Un ciclo completo por su cuenta con otra situación de su lista.</w:t>
+        <w:t>Aplicar el ciclo completo a una situación nueva: Produce → Correct → Upgrade → Practice → Retry → Apply.</w:t>
       </w:r>
     </w:p>
     <w:p>
@@ -2236,7 +2297,7 @@
           <w:color w:val="81552E"/>
           <w:sz w:val="40"/>
         </w:rPr>
-        <w:t>Propósito y mensaje clave</w:t>
+        <w:t>Propósito, mensaje clave y frases claras</w:t>
       </w:r>
     </w:p>
     <w:tbl>
@@ -2286,7 +2347,7 @@
                 <w:i w:val="0"/>
                 <w:sz w:val="20"/>
               </w:rPr>
-              <w:t>Saber para qué habla y cuál es su mensaje clave; construir frases claras y cortas.</w:t>
+              <w:t>Saber qué quiere lograr con su mensaje y construir una versión simple y estable antes de agregar complejidad.</w:t>
             </w:r>
           </w:p>
         </w:tc>
@@ -2305,7 +2366,7 @@
                 <w:color w:val="81552E"/>
                 <w:sz w:val="19"/>
               </w:rPr>
-              <w:t>Apoyo en plataforma</w:t>
+              <w:t>En la plataforma</w:t>
             </w:r>
           </w:p>
         </w:tc>
@@ -2320,7 +2381,7 @@
                 <w:i w:val="0"/>
                 <w:sz w:val="20"/>
               </w:rPr>
-              <w:t>M2.1 Build Clear Sentences.</w:t>
+              <w:t>M2.1 Build Clear Sentences in Real Time (en desarrollo)</w:t>
             </w:r>
           </w:p>
         </w:tc>
@@ -2354,7 +2415,7 @@
                 <w:i w:val="0"/>
                 <w:sz w:val="20"/>
               </w:rPr>
-              <w:t>Antes de hablar, define su propósito y su mensaje clave en una frase, y lo dice con oraciones cortas y completas.</w:t>
+              <w:t>Antes de entrar en detalles, formula su propósito y su mensaje clave, y lo dice con oraciones cortas y estables.</w:t>
             </w:r>
           </w:p>
         </w:tc>
@@ -2388,7 +2449,7 @@
                 <w:i w:val="0"/>
                 <w:sz w:val="20"/>
               </w:rPr>
-              <w:t>Propósito y mensaje clave escritos en una línea cada uno · audio donde el mensaje clave aparece en los primeros 20 segundos · menos frases largas encadenadas.</w:t>
+              <w:t>Propósito y mensaje clave en una frase cada uno · mensaje breve con oraciones claras · menos frases largas encadenadas.</w:t>
             </w:r>
           </w:p>
         </w:tc>
@@ -2415,7 +2476,7 @@
           <w:i/>
           <w:color w:val="8A6A55"/>
         </w:rPr>
-        <w:t>«Estamos en Communicate in Real Time. Hoy el foco es saber qué quieres lograr y decirlo con claridad. Al terminar, vas a poder decir tu mensaje clave en una frase.»</w:t>
+        <w:t>«Estamos en Communicate in Real Time. Hoy el foco es saber qué quieres lograr y decirlo simple. Al terminar, vas a poder decir tu mensaje clave en una frase.»</w:t>
       </w:r>
     </w:p>
     <w:p>
@@ -2429,7 +2490,7 @@
           <w:color w:val="C68C6C"/>
           <w:sz w:val="17"/>
         </w:rPr>
-        <w:t>MICROENSEÑANZA · 5–10 MIN (SI NO VIO LA PLATAFORMA)</w:t>
+        <w:t>MICROENSEÑANZA · 5–10 MIN · OBLIGATORIA SI LA CLASE TODAVÍA NO ESTÁ DISPONIBLE</w:t>
       </w:r>
     </w:p>
     <w:p>
@@ -2437,7 +2498,7 @@
         <w:pStyle w:val="ListBullet"/>
       </w:pPr>
       <w:r>
-        <w:t>Tres preguntas antes de hablar: ¿quién escucha?, ¿qué necesita saber o decidir?, ¿cuál es mi mensaje en una frase?</w:t>
+        <w:t>Propósito: ¿qué quiero que la otra persona entienda, decida o haga?</w:t>
       </w:r>
     </w:p>
     <w:p>
@@ -2445,7 +2506,7 @@
         <w:pStyle w:val="ListBullet"/>
       </w:pPr>
       <w:r>
-        <w:t>Oración clara: sujeto + verbo + información. Una idea por frase.</w:t>
+        <w:t>Mensaje clave en una frase, antes que el contexto.</w:t>
       </w:r>
     </w:p>
     <w:p>
@@ -2453,7 +2514,15 @@
         <w:pStyle w:val="ListBullet"/>
       </w:pPr>
       <w:r>
-        <w:t>Chunks: «The key point is…», «What I need from you is…», «The main thing is…».</w:t>
+        <w:t>Oración clara: sujeto + verbo + información. Una idea por frase. Primero estable, después complejo.</w:t>
+      </w:r>
+    </w:p>
+    <w:p>
+      <w:pPr>
+        <w:pStyle w:val="ListBullet"/>
+      </w:pPr>
+      <w:r>
+        <w:t>Chunks: «The key point is…», «What I need from you is…».</w:t>
       </w:r>
     </w:p>
     <w:p>
@@ -2522,7 +2591,7 @@
           <w:b w:val="0"/>
           <w:i w:val="0"/>
         </w:rPr>
-        <w:t>Antes de cada reunión de la semana, escribir propósito + mensaje clave. Grabar un ejemplo.</w:t>
+        <w:t>Preparar una situación real con propósito + mensaje clave en 2–3 líneas, sin escribir un guion.</w:t>
       </w:r>
     </w:p>
     <w:p>
@@ -2574,7 +2643,7 @@
           <w:color w:val="81552E"/>
           <w:sz w:val="40"/>
         </w:rPr>
-        <w:t>Main Point First</w:t>
+        <w:t>Organize &amp; Prioritize · Main Point First</w:t>
       </w:r>
     </w:p>
     <w:tbl>
@@ -2624,7 +2693,7 @@
                 <w:i w:val="0"/>
                 <w:sz w:val="20"/>
               </w:rPr>
-              <w:t>Organizar y priorizar: el punto principal primero, con Message Map.</w:t>
+              <w:t>Ir al punto y estructurar mensajes fáciles de seguir bajo presión.</w:t>
             </w:r>
           </w:p>
         </w:tc>
@@ -2643,7 +2712,7 @@
                 <w:color w:val="81552E"/>
                 <w:sz w:val="19"/>
               </w:rPr>
-              <w:t>Apoyo en plataforma</w:t>
+              <w:t>En la plataforma</w:t>
             </w:r>
           </w:p>
         </w:tc>
@@ -2658,7 +2727,7 @@
                 <w:i w:val="0"/>
                 <w:sz w:val="20"/>
               </w:rPr>
-              <w:t>M2.3 Organize &amp; Prioritize.</w:t>
+              <w:t>M2.3 Organize &amp; Prioritize Your Message (en desarrollo)</w:t>
             </w:r>
           </w:p>
         </w:tc>
@@ -2692,7 +2761,7 @@
                 <w:i w:val="0"/>
                 <w:sz w:val="20"/>
               </w:rPr>
-              <w:t>Da un update claro en 1–2 minutos: primero el punto principal, después el soporte y cierra con un próximo paso.</w:t>
+              <w:t>Da un update claro de 1–2 minutos: primero el punto principal, después 2–3 puntos de soporte, y cierra con un próximo paso.</w:t>
             </w:r>
           </w:p>
         </w:tc>
@@ -2767,7 +2836,7 @@
           <w:color w:val="C68C6C"/>
           <w:sz w:val="17"/>
         </w:rPr>
-        <w:t>MICROENSEÑANZA · 5–10 MIN (SI NO VIO LA PLATAFORMA)</w:t>
+        <w:t>MICROENSEÑANZA · 5–10 MIN · OBLIGATORIA SI LA CLASE TODAVÍA NO ESTÁ DISPONIBLE</w:t>
       </w:r>
     </w:p>
     <w:p>
@@ -2783,7 +2852,7 @@
         <w:pStyle w:val="ListBullet"/>
       </w:pPr>
       <w:r>
-        <w:t>BLUF (Bottom Line Up Front).</w:t>
+        <w:t>Main Point First / BLUF (Bottom Line Up Front).</w:t>
       </w:r>
     </w:p>
     <w:p>
@@ -2791,7 +2860,7 @@
         <w:pStyle w:val="ListBullet"/>
       </w:pPr>
       <w:r>
-        <w:t>Por qué en inglés profesional el contexto va después del punto, no antes.</w:t>
+        <w:t>Evitar el «context dumping»: el contexto va después del punto, no antes.</w:t>
       </w:r>
     </w:p>
     <w:p>
@@ -2860,7 +2929,7 @@
           <w:b w:val="0"/>
           <w:i w:val="0"/>
         </w:rPr>
-        <w:t>Usar el Message Map antes de una reunión real y contar en el Weekly Report qué pasó.</w:t>
+        <w:t>Grabar un update real aplicando Main Point First y hacer un retry si empieza por el contexto.</w:t>
       </w:r>
     </w:p>
     <w:p>
@@ -2912,7 +2981,7 @@
           <w:color w:val="81552E"/>
           <w:sz w:val="40"/>
         </w:rPr>
-        <w:t>Frameworks flexibles</w:t>
+        <w:t>Flexible Frameworks + Keep Speaking</w:t>
       </w:r>
     </w:p>
     <w:tbl>
@@ -2962,7 +3031,7 @@
                 <w:i w:val="0"/>
                 <w:sz w:val="20"/>
               </w:rPr>
-              <w:t>Elegir la estructura adecuada según la situación.</w:t>
+              <w:t>Sostener el mensaje con una estructura (no con un guion) y seguir hablando cuando falta una palabra.</w:t>
             </w:r>
           </w:p>
         </w:tc>
@@ -2981,7 +3050,7 @@
                 <w:color w:val="81552E"/>
                 <w:sz w:val="19"/>
               </w:rPr>
-              <w:t>Apoyo en plataforma</w:t>
+              <w:t>En la plataforma</w:t>
             </w:r>
           </w:p>
         </w:tc>
@@ -2996,7 +3065,7 @@
                 <w:i w:val="0"/>
                 <w:sz w:val="20"/>
               </w:rPr>
-              <w:t>M2.3 Organize &amp; Prioritize (frameworks).</w:t>
+              <w:t>M2.3 Organize &amp; Prioritize Your Message (frameworks) (en desarrollo) · M2.2 Keep Speaking When the Word Doesn't Come (grabada)</w:t>
             </w:r>
           </w:p>
         </w:tc>
@@ -3030,7 +3099,7 @@
                 <w:i w:val="0"/>
                 <w:sz w:val="20"/>
               </w:rPr>
-              <w:t>Elige y usa la estructura adecuada para un update, un problema o una recomendación.</w:t>
+              <w:t>Explica la misma idea de dos maneras distintas y, cuando falta una palabra, la rodea y llega al significado sin frenar ni pasar al español.</w:t>
             </w:r>
           </w:p>
         </w:tc>
@@ -3064,7 +3133,7 @@
                 <w:i w:val="0"/>
                 <w:sz w:val="20"/>
               </w:rPr>
-              <w:t>La misma situación dicha con dos frameworks distintos · puede explicar cuál eligió y por qué.</w:t>
+              <w:t>La misma situación dicha con dos estructuras · resuelve 2–3 bloqueos parafraseando.</w:t>
             </w:r>
           </w:p>
         </w:tc>
@@ -3091,7 +3160,7 @@
           <w:i/>
           <w:color w:val="8A6A55"/>
         </w:rPr>
-        <w:t>«Estamos en Communicate in Real Time. Hoy el foco es elegir la estructura según la situación. Al terminar, vas a poder organizar un update, un problema o una recomendación sin guion.»</w:t>
+        <w:t>«Estamos en Communicate in Real Time. Hoy el foco es sostener tu mensaje sin guion. Al terminar, vas a poder seguir hablando aunque falte una palabra.»</w:t>
       </w:r>
     </w:p>
     <w:p>
@@ -3105,7 +3174,7 @@
           <w:color w:val="C68C6C"/>
           <w:sz w:val="17"/>
         </w:rPr>
-        <w:t>MICROENSEÑANZA · 5–10 MIN (SI NO VIO LA PLATAFORMA)</w:t>
+        <w:t>MICROENSEÑANZA · 5–10 MIN · OBLIGATORIA SI LA CLASE TODAVÍA NO ESTÁ DISPONIBLE</w:t>
       </w:r>
     </w:p>
     <w:p>
@@ -3113,7 +3182,7 @@
         <w:pStyle w:val="ListBullet"/>
       </w:pPr>
       <w:r>
-        <w:t>STATUS → DELTA → WHY → ACTION → OUTLOOK, para updates.</w:t>
+        <w:t>Frameworks según la situación: STATUS → DELTA → WHY → ACTION → OUTLOOK para updates; Situation → Issue → Action para problemas; Point → Evidence → Implication para recomendaciones.</w:t>
       </w:r>
     </w:p>
     <w:p>
@@ -3121,7 +3190,7 @@
         <w:pStyle w:val="ListBullet"/>
       </w:pPr>
       <w:r>
-        <w:t>Situation → Issue → Action, para problemas.</w:t>
+        <w:t>Una estructura es un mapa, no un texto memorizado.</w:t>
       </w:r>
     </w:p>
     <w:p>
@@ -3129,7 +3198,7 @@
         <w:pStyle w:val="ListBullet"/>
       </w:pPr>
       <w:r>
-        <w:t>Point → Evidence → Implication, para recomendaciones.</w:t>
+        <w:t>Cuando falta la palabra: Category / Function / Example / Contrast («It's a kind of…», «It's what we use to…», «For example…», «It's not… but…»).</w:t>
       </w:r>
     </w:p>
     <w:p>
@@ -3137,7 +3206,7 @@
         <w:pStyle w:val="ListBullet"/>
       </w:pPr>
       <w:r>
-        <w:t>Una estructura es un mapa, no un guion.</w:t>
+        <w:t>Reformular sin abandonar la idea: «What I mean is…», «Let me put it another way».</w:t>
       </w:r>
     </w:p>
     <w:p>
@@ -3160,7 +3229,7 @@
           <w:b w:val="0"/>
           <w:i w:val="0"/>
         </w:rPr>
-        <w:t>Sol: un retraso en el proyecto (Situation → Issue → Action). Virginia: una recomendación al CEO (Point → Evidence → Implication). Belén: el status del proveedor (STATUS → DELTA…).</w:t>
+        <w:t>Explica una situación con el framework que le corresponde y un término de su trabajo sin usar la palabra clave. Belén: un requisito de compliance del proveedor. Sol: un retraso y una dependencia técnica. Virginia: una recomendación y un indicador financiero.</w:t>
       </w:r>
     </w:p>
     <w:p>
@@ -3183,7 +3252,7 @@
           <w:b w:val="0"/>
           <w:i w:val="0"/>
         </w:rPr>
-        <w:t>Repite con el framework que mejor le funcionó. Presión: cambia el interlocutor (de su manager a alguien de otra área).</w:t>
+        <w:t>La misma situación con otro framework y otras palabras prohibidas. Presión: «Sorry, I don't understand. Can you explain it differently?».</w:t>
       </w:r>
     </w:p>
     <w:p>
@@ -3206,7 +3275,7 @@
           <w:b w:val="0"/>
           <w:i w:val="0"/>
         </w:rPr>
-        <w:t>Identificar qué situación de su semana pide cada framework y practicar una con bot.</w:t>
+        <w:t>Elegir 3 términos de su trabajo y practicar cómo explicarlos sin decir la palabra exacta.</w:t>
       </w:r>
     </w:p>
     <w:p>
@@ -3230,7 +3299,7 @@
           <w:i/>
           <w:color w:val="8A6A55"/>
         </w:rPr>
-        <w:t>Presión: se le cambia el objetivo a mitad de camino y tiene que reorganizar.</w:t>
+        <w:t>Que explique lo mismo a alguien que no es de su área.</w:t>
       </w:r>
     </w:p>
     <w:p>
@@ -3258,7 +3327,7 @@
           <w:color w:val="81552E"/>
           <w:sz w:val="40"/>
         </w:rPr>
-        <w:t>Keep Speaking</w:t>
+        <w:t>Gain Time + Repair &amp; Continue</w:t>
       </w:r>
     </w:p>
     <w:tbl>
@@ -3308,7 +3377,7 @@
                 <w:i w:val="0"/>
                 <w:sz w:val="20"/>
               </w:rPr>
-              <w:t>Seguir hablando cuando no aparece la palabra: parafrasear, describir, simplificar.</w:t>
+              <w:t>Ganar segundos útiles, recuperarse de errores o de la pérdida del hilo y continuar sin reiniciar.</w:t>
             </w:r>
           </w:p>
         </w:tc>
@@ -3327,7 +3396,7 @@
                 <w:color w:val="81552E"/>
                 <w:sz w:val="19"/>
               </w:rPr>
-              <w:t>Apoyo en plataforma</w:t>
+              <w:t>En la plataforma</w:t>
             </w:r>
           </w:p>
         </w:tc>
@@ -3342,7 +3411,7 @@
                 <w:i w:val="0"/>
                 <w:sz w:val="20"/>
               </w:rPr>
-              <w:t>M2.2 Keep Speaking When the Word Doesn't Come.</w:t>
+              <w:t>M2.4 Repair &amp; Continue (todavía no creada)</w:t>
             </w:r>
           </w:p>
         </w:tc>
@@ -3376,7 +3445,7 @@
                 <w:i w:val="0"/>
                 <w:sz w:val="20"/>
               </w:rPr>
-              <w:t>Cuando no encuentra una palabra, la rodea y sigue, sin frenar ni pasar al español.</w:t>
+              <w:t>Ante un false start, un error o la pérdida del hilo, se recupera y vuelve al punto principal sin empezar de nuevo.</w:t>
             </w:r>
           </w:p>
         </w:tc>
@@ -3410,7 +3479,7 @@
                 <w:i w:val="0"/>
                 <w:sz w:val="20"/>
               </w:rPr>
-              <w:t>Producción donde resuelve 2–3 bloqueos parafraseando · menos silencios largos y reinicios.</w:t>
+              <w:t>Se recupera de al menos 2 interrupciones o errores sin reiniciar la explicación · usa el tiempo para pensar de forma profesional.</w:t>
             </w:r>
           </w:p>
         </w:tc>
@@ -3437,7 +3506,7 @@
           <w:i/>
           <w:color w:val="8A6A55"/>
         </w:rPr>
-        <w:t>«Estamos en Communicate in Real Time. Hoy el foco es seguir hablando aunque falte una palabra. Al terminar, vas a poder resolver un bloqueo sin frenar.»</w:t>
+        <w:t>«Estamos en Communicate in Real Time. Hoy el foco es recuperarte y seguir cuando algo se desarma. Al terminar, vas a poder volver al punto sin empezar de cero.»</w:t>
       </w:r>
     </w:p>
     <w:p>
@@ -3451,7 +3520,7 @@
           <w:color w:val="C68C6C"/>
           <w:sz w:val="17"/>
         </w:rPr>
-        <w:t>MICROENSEÑANZA · 5–10 MIN (SI NO VIO LA PLATAFORMA)</w:t>
+        <w:t>MICROENSEÑANZA · 5–10 MIN · OBLIGATORIA SI LA CLASE TODAVÍA NO ESTÁ DISPONIBLE</w:t>
       </w:r>
     </w:p>
     <w:p>
@@ -3459,7 +3528,7 @@
         <w:pStyle w:val="ListBullet"/>
       </w:pPr>
       <w:r>
-        <w:t>Estrategias: describir la función («the thing we use to…»), dar un ejemplo, usar una palabra más general, decir lo contrario («it's not…»), simplificar la idea.</w:t>
+        <w:t>Ganar tiempo con frases y pausas funcionales, no con fillers vacíos: «That's a good question. Let me think…», «Give me a second».</w:t>
       </w:r>
     </w:p>
     <w:p>
@@ -3467,7 +3536,15 @@
         <w:pStyle w:val="ListBullet"/>
       </w:pPr>
       <w:r>
-        <w:t>Chunks: «What I mean is…», «It's a kind of…», «Let me put it another way».</w:t>
+        <w:t>Recuperar el hilo: «Going back to…», «As I was saying…», «Where was I? Right…».</w:t>
+      </w:r>
+    </w:p>
+    <w:p>
+      <w:pPr>
+        <w:pStyle w:val="ListBullet"/>
+      </w:pPr>
+      <w:r>
+        <w:t>Repair &amp; Continue: autocorregirse sin frenar («Sorry, I mean…») y volver al main point.</w:t>
       </w:r>
     </w:p>
     <w:p>
@@ -3490,7 +3567,7 @@
           <w:b w:val="0"/>
           <w:i w:val="0"/>
         </w:rPr>
-        <w:t>Explica un término de su trabajo sin poder usar la palabra clave. Belén: un requisito de compliance del proveedor. Sol: una dependencia técnica. Virginia: un indicador financiero.</w:t>
+        <w:t>Role play de su situación con interrupciones controladas. Virginia: el CEO la corta a mitad del update. Sol: un stakeholder cambia de tema. Belén: el proveedor la interrumpe con una duda.</w:t>
       </w:r>
     </w:p>
     <w:p>
@@ -3513,7 +3590,7 @@
           <w:b w:val="0"/>
           <w:i w:val="0"/>
         </w:rPr>
-        <w:t>La misma explicación con otras palabras prohibidas. Presión: «Sorry, I don't understand. Can you explain it differently?».</w:t>
+        <w:t>La misma intervención con una interrupción nueva.</w:t>
       </w:r>
     </w:p>
     <w:p>
@@ -3536,7 +3613,7 @@
           <w:b w:val="0"/>
           <w:i w:val="0"/>
         </w:rPr>
-        <w:t>Juego de palabras prohibidas con bot, con tres términos de su trabajo.</w:t>
+        <w:t>Un role play corto con bot con una interrupción deliberada, practicando repair + continue.</w:t>
       </w:r>
     </w:p>
     <w:p>
@@ -3560,7 +3637,7 @@
           <w:i/>
           <w:color w:val="8A6A55"/>
         </w:rPr>
-        <w:t>Que explique lo mismo a alguien que no es de su área.</w:t>
+        <w:t>Dos interrupciones seguidas o una pregunta que la saca de su tema.</w:t>
       </w:r>
     </w:p>
     <w:p>
@@ -3588,7 +3665,7 @@
           <w:color w:val="81552E"/>
           <w:sz w:val="40"/>
         </w:rPr>
-        <w:t>Repair &amp; Continue + manejar la interacción</w:t>
+        <w:t>Manage the Interaction</w:t>
       </w:r>
     </w:p>
     <w:tbl>
@@ -3638,7 +3715,7 @@
                 <w:i w:val="0"/>
                 <w:sz w:val="20"/>
               </w:rPr>
-              <w:t>Ganar tiempo, pedir aclaración, recuperar el hilo y responder preguntas e interrupciones.</w:t>
+              <w:t>Responder, aclarar, preguntar, hacer pushback y adaptarse cuando la conversación cambia.</w:t>
             </w:r>
           </w:p>
         </w:tc>
@@ -3657,7 +3734,7 @@
                 <w:color w:val="81552E"/>
                 <w:sz w:val="19"/>
               </w:rPr>
-              <w:t>Apoyo en plataforma</w:t>
+              <w:t>En la plataforma</w:t>
             </w:r>
           </w:p>
         </w:tc>
@@ -3672,7 +3749,7 @@
                 <w:i w:val="0"/>
                 <w:sz w:val="20"/>
               </w:rPr>
-              <w:t>M2.4 Repair &amp; Continue · M2.5 Manage the Interaction.</w:t>
+              <w:t>M2.5 Manage the Interaction (todavía no creada) · Workplace Guides 6 y 7 (en desarrollo)</w:t>
             </w:r>
           </w:p>
         </w:tc>
@@ -3706,7 +3783,7 @@
                 <w:i w:val="0"/>
                 <w:sz w:val="20"/>
               </w:rPr>
-              <w:t>Ante una pregunta, una interrupción o un error propio, se recupera y sigue sin reiniciar la explicación.</w:t>
+              <w:t>Responde una secuencia de preguntas no preparadas manteniendo su propósito, y pide aclaración o hace pushback sin bloquearse.</w:t>
             </w:r>
           </w:p>
         </w:tc>
@@ -3740,7 +3817,7 @@
                 <w:i w:val="0"/>
                 <w:sz w:val="20"/>
               </w:rPr>
-              <w:t>Role play con interrupciones donde gana tiempo, pide aclaración y retoma el hilo · responde las preguntas con una respuesta directa primero.</w:t>
+              <w:t>Ronda de preguntas no preparadas respondida con una respuesta directa primero · al menos una aclaración o pushback bien resuelto.</w:t>
             </w:r>
           </w:p>
         </w:tc>
@@ -3767,7 +3844,7 @@
           <w:i/>
           <w:color w:val="8A6A55"/>
         </w:rPr>
-        <w:t>«Estamos en Communicate in Real Time. Hoy el foco es recuperarte y seguir cuando te interrumpen o te preguntan. Al terminar, vas a poder manejar preguntas sin perder el hilo.»</w:t>
+        <w:t>«Estamos en Communicate in Real Time. Hoy el foco es manejar la conversación cuando no sale como planeaste. Al terminar, vas a poder responder preguntas sin perder tu objetivo.»</w:t>
       </w:r>
     </w:p>
     <w:p>
@@ -3781,7 +3858,7 @@
           <w:color w:val="C68C6C"/>
           <w:sz w:val="17"/>
         </w:rPr>
-        <w:t>MICROENSEÑANZA · 5–10 MIN (SI NO VIO LA PLATAFORMA)</w:t>
+        <w:t>MICROENSEÑANZA · 5–10 MIN · OBLIGATORIA SI LA CLASE TODAVÍA NO ESTÁ DISPONIBLE</w:t>
       </w:r>
     </w:p>
     <w:p>
@@ -3789,7 +3866,7 @@
         <w:pStyle w:val="ListBullet"/>
       </w:pPr>
       <w:r>
-        <w:t>Ganar tiempo: «That's a good question. Let me think…».</w:t>
+        <w:t>Responder preguntas: respuesta directa + una razón.</w:t>
       </w:r>
     </w:p>
     <w:p>
@@ -3797,7 +3874,7 @@
         <w:pStyle w:val="ListBullet"/>
       </w:pPr>
       <w:r>
-        <w:t>Pedir aclaración: «Do you mean…?».</w:t>
+        <w:t>Aclarar y chequear comprensión: «Do you mean…?», «Just to make sure I understand…».</w:t>
       </w:r>
     </w:p>
     <w:p>
@@ -3805,7 +3882,7 @@
         <w:pStyle w:val="ListBullet"/>
       </w:pPr>
       <w:r>
-        <w:t>Retomar: «Going back to…», «As I was saying…». Autocorregirse sin frenar: «Sorry, I mean…».</w:t>
+        <w:t>Pushback y desacuerdo con tono profesional: «I see your point, but…», «I'd suggest a different approach».</w:t>
       </w:r>
     </w:p>
     <w:p>
@@ -3813,7 +3890,7 @@
         <w:pStyle w:val="ListBullet"/>
       </w:pPr>
       <w:r>
-        <w:t>Responder preguntas: respuesta directa + una razón.</w:t>
+        <w:t>Adaptar el nivel de detalle según la reacción del otro.</w:t>
       </w:r>
     </w:p>
     <w:p>
@@ -3836,7 +3913,7 @@
           <w:b w:val="0"/>
           <w:i w:val="0"/>
         </w:rPr>
-        <w:t>Ronda de preguntas sobre su situación. Virginia: preguntas incómodas del CEO. Sol: un stakeholder impaciente. Belén: un proveedor que no entiende un paso.</w:t>
+        <w:t>Q&amp;A de su situación con la Workplace Guide que corresponda (Disagreeing or Clarifying Politely / Handling Unexpected Questions). Virginia: preguntas incómodas del CEO. Sol: un stakeholder impaciente. Belén: un proveedor que no acepta un plazo.</w:t>
       </w:r>
     </w:p>
     <w:p>
@@ -3859,7 +3936,7 @@
           <w:b w:val="0"/>
           <w:i w:val="0"/>
         </w:rPr>
-        <w:t>La misma ronda de preguntas. Presión: dos preguntas seguidas o una objeción.</w:t>
+        <w:t>La misma ronda de preguntas. Presión: una objeción o dos preguntas seguidas.</w:t>
       </w:r>
     </w:p>
     <w:p>
@@ -3882,7 +3959,7 @@
           <w:b w:val="0"/>
           <w:i w:val="0"/>
         </w:rPr>
-        <w:t>Anticipar tres preguntas difíciles de una reunión real y practicarlas con bot.</w:t>
+        <w:t>Aplicar la guía a una interacción real próxima y registrar en el Weekly Report qué funcionó y qué costó.</w:t>
       </w:r>
     </w:p>
     <w:p>
@@ -3934,7 +4011,7 @@
           <w:color w:val="81552E"/>
           <w:sz w:val="40"/>
         </w:rPr>
-        <w:t>Clara, concisa y específica + revisión de mitad</w:t>
+        <w:t>Clear, Concise &amp; Specific · integración</w:t>
       </w:r>
     </w:p>
     <w:tbl>
@@ -3984,7 +4061,7 @@
                 <w:i w:val="0"/>
                 <w:sz w:val="20"/>
               </w:rPr>
-              <w:t>Integrar la etapa en una situación real completa: clara, concisa y específica.</w:t>
+              <w:t>Integrar la etapa en una situación laboral completa: clara, concisa, específica y adaptable.</w:t>
             </w:r>
           </w:p>
         </w:tc>
@@ -4003,7 +4080,7 @@
                 <w:color w:val="81552E"/>
                 <w:sz w:val="19"/>
               </w:rPr>
-              <w:t>Apoyo en plataforma</w:t>
+              <w:t>En la plataforma</w:t>
             </w:r>
           </w:p>
         </w:tc>
@@ -4018,7 +4095,7 @@
                 <w:i w:val="0"/>
                 <w:sz w:val="20"/>
               </w:rPr>
-              <w:t>M2.6 Workplace Practice Library + la Workplace Guide que corresponda.</w:t>
+              <w:t>M2.6 How to Use Your Workplace Practice Library (todavía no creada) · Workplace Guides 1–8 (en desarrollo)</w:t>
             </w:r>
           </w:p>
         </w:tc>
@@ -4052,7 +4129,7 @@
                 <w:i w:val="0"/>
                 <w:sz w:val="20"/>
               </w:rPr>
-              <w:t>Maneja una situación real completa (update + preguntas) de forma clara, concisa y específica.</w:t>
+              <w:t>Completa una situación laboral de principio a fin (mensaje + preguntas) con menos dependencia de guion.</w:t>
             </w:r>
           </w:p>
         </w:tc>
@@ -4086,7 +4163,7 @@
                 <w:i w:val="0"/>
                 <w:sz w:val="20"/>
               </w:rPr>
-              <w:t>Situación completa grabada y comparada con el Starting Point y con la sesión 2 · lista de 2–3 patrones lingüísticos prioritarios para Polish.</w:t>
+              <w:t>Simulación completa grabada y comparada con el Starting Point · puede nombrar 2–3 capacidades que ahora aparecen con más consistencia · 2–3 patrones de precisión elegidos para las sesiones 11–16.</w:t>
             </w:r>
           </w:p>
         </w:tc>
@@ -4120,7 +4197,7 @@
                 <w:i w:val="0"/>
                 <w:sz w:val="20"/>
               </w:rPr>
-              <w:t>Revisión de mitad de programa. Comparan con el Starting Point: qué ya hace sola y qué patrones lingüísticos todavía limitan su claridad. Eso define el foco de las sesiones 11–16.</w:t>
+              <w:t>Revisión de mitad de programa. Comparan con el Starting Point y la evidencia de las semanas 2–10: qué ya hace sola y qué patrones todavía limitan su claridad. Eso define el foco de Polish.</w:t>
             </w:r>
           </w:p>
         </w:tc>
@@ -4161,7 +4238,7 @@
           <w:color w:val="C68C6C"/>
           <w:sz w:val="17"/>
         </w:rPr>
-        <w:t>MICROENSEÑANZA · 5–10 MIN (SI NO VIO LA PLATAFORMA)</w:t>
+        <w:t>MICROENSEÑANZA · 5–10 MIN · OBLIGATORIA SI LA CLASE TODAVÍA NO ESTÁ DISPONIBLE</w:t>
       </w:r>
     </w:p>
     <w:p>
@@ -4169,7 +4246,7 @@
         <w:pStyle w:val="ListBullet"/>
       </w:pPr>
       <w:r>
-        <w:t>Clara, concisa y específica: cortar contexto innecesario, usar números y fechas concretas, cerrar con acción, responsable y plazo.</w:t>
+        <w:t>Clara, concisa y específica: cortar repetición, vaguedad y contexto innecesario; usar números y fechas concretas; cerrar con acción, responsable y plazo.</w:t>
       </w:r>
     </w:p>
     <w:p>
@@ -4177,7 +4254,7 @@
         <w:pStyle w:val="ListBullet"/>
       </w:pPr>
       <w:r>
-        <w:t>La Workplace Guide que corresponda a su situación.</w:t>
+        <w:t>Cómo elegir la Workplace Guide según la situación (Project Update, Problem &amp; Next Steps, Explain a Process, Presentation…).</w:t>
       </w:r>
     </w:p>
     <w:p>
@@ -4200,7 +4277,7 @@
           <w:b w:val="0"/>
           <w:i w:val="0"/>
         </w:rPr>
-        <w:t>La situación más importante de su mes. Belén: el kickoff completo con el proveedor. Sol: el status con preguntas. Virginia: el update al CEO con Q&amp;A.</w:t>
+        <w:t>La situación más importante de su mes, con la guía que corresponda. Belén: kickoff completo con el proveedor (Explaining a Process). Sol: status con preguntas (Giving a Clear Project Update). Virginia: update al CEO con Q&amp;A.</w:t>
       </w:r>
     </w:p>
     <w:p>
@@ -4246,7 +4323,7 @@
           <w:b w:val="0"/>
           <w:i w:val="0"/>
         </w:rPr>
-        <w:t>Confirmar juntas los 2–3 patrones prioritarios para las semanas 11–16.</w:t>
+        <w:t>Weekly Report de mitad de programa con evidencia concreta y su foco para Polish.</w:t>
       </w:r>
     </w:p>
     <w:p>
@@ -4274,7 +4351,7 @@
           <w:color w:val="81552E"/>
           <w:sz w:val="40"/>
         </w:rPr>
-        <w:t>Verb System I</w:t>
+        <w:t>The English Verb System I · marcos temporales</w:t>
       </w:r>
     </w:p>
     <w:tbl>
@@ -4324,7 +4401,7 @@
                 <w:i w:val="0"/>
                 <w:sz w:val="20"/>
               </w:rPr>
-              <w:t>Tiempos verbales para lo que pasó, lo que está pasando y lo habitual.</w:t>
+              <w:t>Usar el sistema verbal con estabilidad para hablar de presente, pasado y futuro en situaciones reales.</w:t>
             </w:r>
           </w:p>
         </w:tc>
@@ -4343,7 +4420,7 @@
                 <w:color w:val="81552E"/>
                 <w:sz w:val="19"/>
               </w:rPr>
-              <w:t>Apoyo en plataforma</w:t>
+              <w:t>En la plataforma</w:t>
             </w:r>
           </w:p>
         </w:tc>
@@ -4358,7 +4435,7 @@
                 <w:i w:val="0"/>
                 <w:sz w:val="20"/>
               </w:rPr>
-              <w:t>M3.1 Verb System.</w:t>
+              <w:t>M3.1 The English Verb System (en desarrollo)</w:t>
             </w:r>
           </w:p>
         </w:tc>
@@ -4392,7 +4469,7 @@
                 <w:i w:val="0"/>
                 <w:sz w:val="20"/>
               </w:rPr>
-              <w:t>Usa el tiempo correcto para hablar de lo que ya pasó, lo que está pasando y cómo funcionan las cosas en su trabajo.</w:t>
+              <w:t>Cuenta un update o una situación manteniendo una línea temporal comprensible, sin cambios de tiempo innecesarios.</w:t>
             </w:r>
           </w:p>
         </w:tc>
@@ -4426,7 +4503,7 @@
                 <w:i w:val="0"/>
                 <w:sz w:val="20"/>
               </w:rPr>
-              <w:t>Update donde su patrón prioritario de tiempos verbales sale bien en la mayoría de los casos · comparación intento 1 vs retry.</w:t>
+              <w:t>Update con pasado + presente + próximos pasos, con línea temporal clara · baja visible de su patrón verbal recurrente.</w:t>
             </w:r>
           </w:p>
         </w:tc>
@@ -4453,7 +4530,7 @@
           <w:i/>
           <w:color w:val="8A6A55"/>
         </w:rPr>
-        <w:t>«Estamos en Polish Your English. Hoy el foco es usar bien los tiempos verbales en tus updates. Al terminar, vas a poder contar qué hicieron, qué están haciendo y cómo funciona.»</w:t>
+        <w:t>«Estamos en Polish Your English. Hoy el foco es usar bien los tiempos verbales en tus updates. Al terminar, vas a poder contar qué hicieron, qué están haciendo y qué viene.»</w:t>
       </w:r>
     </w:p>
     <w:p>
@@ -4467,7 +4544,7 @@
           <w:color w:val="C68C6C"/>
           <w:sz w:val="17"/>
         </w:rPr>
-        <w:t>MICROENSEÑANZA · 5–10 MIN (SI NO VIO LA PLATAFORMA)</w:t>
+        <w:t>MICROENSEÑANZA · 5–10 MIN · OBLIGATORIA SI LA CLASE TODAVÍA NO ESTÁ DISPONIBLE</w:t>
       </w:r>
     </w:p>
     <w:p>
@@ -4475,7 +4552,7 @@
         <w:pStyle w:val="ListBullet"/>
       </w:pPr>
       <w:r>
-        <w:t>La línea de tiempo de un update: what we did (past simple) / what we're doing (present continuous) / how it usually works (present simple).</w:t>
+        <w:t>Primero la referencia de tiempo, después el nombre del tiempo verbal.</w:t>
       </w:r>
     </w:p>
     <w:p>
@@ -4483,7 +4560,15 @@
         <w:pStyle w:val="ListBullet"/>
       </w:pPr>
       <w:r>
-        <w:t>Su error más frecuente, según la revisión de la sesión 10.</w:t>
+        <w:t>La línea de un update: what we did (past) / what we're doing (present continuous) / how it works (present simple) / what's next (future).</w:t>
+      </w:r>
+    </w:p>
+    <w:p>
+      <w:pPr>
+        <w:pStyle w:val="ListBullet"/>
+      </w:pPr>
+      <w:r>
+        <w:t>Su Error Radar verbal: el error más frecuente de ella, según la revisión de la sesión 10.</w:t>
       </w:r>
     </w:p>
     <w:p>
@@ -4506,7 +4591,7 @@
           <w:b w:val="0"/>
           <w:i w:val="0"/>
         </w:rPr>
-        <w:t>Sol: qué hicieron, qué están haciendo y cómo sigue. Belén: cómo funciona normalmente el onboarding y qué está pasando con este proveedor. Virginia: resultados de la semana.</w:t>
+        <w:t>Sol: qué hicieron, qué están haciendo y cómo sigue. Belén: cómo funciona normalmente el onboarding y qué está pasando con este proveedor. Virginia: resultados de la semana y próximos pasos.</w:t>
       </w:r>
     </w:p>
     <w:p>
@@ -4552,7 +4637,7 @@
           <w:b w:val="0"/>
           <w:i w:val="0"/>
         </w:rPr>
-        <w:t>Grabar el update semanal y marcar los verbos con Color Method.</w:t>
+        <w:t>Grabar un update con pasado + presente + próximos pasos y revisarlo con su Error Radar verbal.</w:t>
       </w:r>
     </w:p>
     <w:p>
@@ -4576,7 +4661,7 @@
           <w:i/>
           <w:color w:val="8A6A55"/>
         </w:rPr>
-        <w:t>Pasa directo a Verb System II.</w:t>
+        <w:t>Pasa directo al Verb System II.</w:t>
       </w:r>
     </w:p>
     <w:p>
@@ -4604,7 +4689,7 @@
           <w:color w:val="81552E"/>
           <w:sz w:val="40"/>
         </w:rPr>
-        <w:t>Verb System II</w:t>
+        <w:t>The English Verb System II · aspecto y experiencia</w:t>
       </w:r>
     </w:p>
     <w:tbl>
@@ -4654,7 +4739,7 @@
                 <w:i w:val="0"/>
                 <w:sz w:val="20"/>
               </w:rPr>
-              <w:t>Present perfect y futuro: resultados hasta ahora, planes y compromisos.</w:t>
+              <w:t>Elegir formas verbales con precisión al hablar de experiencia, duración, progreso y resultados.</w:t>
             </w:r>
           </w:p>
         </w:tc>
@@ -4673,7 +4758,7 @@
                 <w:color w:val="81552E"/>
                 <w:sz w:val="19"/>
               </w:rPr>
-              <w:t>Apoyo en plataforma</w:t>
+              <w:t>En la plataforma</w:t>
             </w:r>
           </w:p>
         </w:tc>
@@ -4688,7 +4773,7 @@
                 <w:i w:val="0"/>
                 <w:sz w:val="20"/>
               </w:rPr>
-              <w:t>M3.1 Verb System.</w:t>
+              <w:t>M3.1 The English Verb System (en desarrollo) · Precision Library: Present Perfect (según necesidad)</w:t>
             </w:r>
           </w:p>
         </w:tc>
@@ -4722,7 +4807,7 @@
                 <w:i w:val="0"/>
                 <w:sz w:val="20"/>
               </w:rPr>
-              <w:t>Distingue resultados hasta ahora de hechos terminados, y habla de planes y compromisos con la forma adecuada.</w:t>
+              <w:t>Expresa progreso, duración y resultados hasta ahora con una elección verbal coherente, sin perder fluidez.</w:t>
             </w:r>
           </w:p>
         </w:tc>
@@ -4756,7 +4841,7 @@
                 <w:i w:val="0"/>
                 <w:sz w:val="20"/>
               </w:rPr>
-              <w:t>Update con «so far / already / yet» y próximos pasos en futuro, bien usados.</w:t>
+              <w:t>Update con «so far / already / yet / for / since» bien usados · mantiene fluidez aunque esté corrigiendo un patrón.</w:t>
             </w:r>
           </w:p>
         </w:tc>
@@ -4783,7 +4868,7 @@
           <w:i/>
           <w:color w:val="8A6A55"/>
         </w:rPr>
-        <w:t>«Estamos en Polish Your English. Hoy el foco es hablar de resultados y de próximos pasos. Al terminar, vas a poder decir qué está hecho, qué falta y qué viene.»</w:t>
+        <w:t>«Estamos en Polish Your English. Hoy el foco es hablar de resultados, progreso y duración. Al terminar, vas a poder decir qué está hecho, qué falta y desde cuándo.»</w:t>
       </w:r>
     </w:p>
     <w:p>
@@ -4797,7 +4882,7 @@
           <w:color w:val="C68C6C"/>
           <w:sz w:val="17"/>
         </w:rPr>
-        <w:t>MICROENSEÑANZA · 5–10 MIN (SI NO VIO LA PLATAFORMA)</w:t>
+        <w:t>MICROENSEÑANZA · 5–10 MIN · OBLIGATORIA SI LA CLASE TODAVÍA NO ESTÁ DISPONIBLE</w:t>
       </w:r>
     </w:p>
     <w:p>
@@ -4805,7 +4890,7 @@
         <w:pStyle w:val="ListBullet"/>
       </w:pPr>
       <w:r>
-        <w:t>«We've completed…» (resultado hasta ahora) vs «We completed it on Monday» (hecho con fecha).</w:t>
+        <w:t>Present Perfect vs Past Simple: «We've completed…» (resultado hasta ahora) vs «We completed it on Monday» (hecho con fecha).</w:t>
       </w:r>
     </w:p>
     <w:p>
@@ -4813,7 +4898,15 @@
         <w:pStyle w:val="ListBullet"/>
       </w:pPr>
       <w:r>
-        <w:t>Futuro: plan («We're going to…»), algo agendado («We're meeting them on Friday»), compromiso en el momento («I'll send it today»).</w:t>
+        <w:t>Progreso y duración: «We've been working on this since March».</w:t>
+      </w:r>
+    </w:p>
+    <w:p>
+      <w:pPr>
+        <w:pStyle w:val="ListBullet"/>
+      </w:pPr>
+      <w:r>
+        <w:t>Cuándo el perfecto o el continuo cambian el mensaje.</w:t>
       </w:r>
     </w:p>
     <w:p>
@@ -4836,7 +4929,7 @@
           <w:b w:val="0"/>
           <w:i w:val="0"/>
         </w:rPr>
-        <w:t>Virginia: resultados del trimestre hasta ahora y próximos pasos. Belén: qué ya completó el proveedor y qué falta. Sol: avances y próximos hitos del proyecto.</w:t>
+        <w:t>Virginia: resultados del trimestre hasta ahora. Belén: qué ya completó el proveedor y qué falta. Sol: avances del proyecto desde el último update.</w:t>
       </w:r>
     </w:p>
     <w:p>
@@ -4859,7 +4952,7 @@
           <w:b w:val="0"/>
           <w:i w:val="0"/>
         </w:rPr>
-        <w:t>El mismo update. Presión: «What's still pending?».</w:t>
+        <w:t>El mismo update. Presión: «What's still pending?», «How long has that been an issue?».</w:t>
       </w:r>
     </w:p>
     <w:p>
@@ -4882,7 +4975,7 @@
           <w:b w:val="0"/>
           <w:i w:val="0"/>
         </w:rPr>
-        <w:t>Update semanal con «so far» y tres próximos pasos en futuro.</w:t>
+        <w:t>Aplicar los contrastes verbales a un proyecto real y traer 3 ejemplos propios.</w:t>
       </w:r>
     </w:p>
     <w:p>
@@ -4984,7 +5077,7 @@
                 <w:i w:val="0"/>
                 <w:sz w:val="20"/>
               </w:rPr>
-              <w:t>Hacer preguntas claras y ordenar bien la frase.</w:t>
+              <w:t>Construir preguntas y oraciones con un orden estable bajo presión.</w:t>
             </w:r>
           </w:p>
         </w:tc>
@@ -5003,7 +5096,7 @@
                 <w:color w:val="81552E"/>
                 <w:sz w:val="19"/>
               </w:rPr>
-              <w:t>Apoyo en plataforma</w:t>
+              <w:t>En la plataforma</w:t>
             </w:r>
           </w:p>
         </w:tc>
@@ -5018,7 +5111,7 @@
                 <w:i w:val="0"/>
                 <w:sz w:val="20"/>
               </w:rPr>
-              <w:t>M3.2 Questions &amp; Word Order.</w:t>
+              <w:t>M3.2 Questions &amp; Word Order (en desarrollo) · Precision Library: Translation Patterns (según necesidad)</w:t>
             </w:r>
           </w:p>
         </w:tc>
@@ -5052,7 +5145,7 @@
                 <w:i w:val="0"/>
                 <w:sz w:val="20"/>
               </w:rPr>
-              <w:t>Formula preguntas directas e indirectas correctas y mantiene el orden de la frase en oraciones largas.</w:t>
+              <w:t>Formula preguntas claras (directas e indirectas) sin perder tiempo en la estructura y mantiene el orden de la frase al hablar.</w:t>
             </w:r>
           </w:p>
         </w:tc>
@@ -5086,7 +5179,7 @@
                 <w:i w:val="0"/>
                 <w:sz w:val="20"/>
               </w:rPr>
-              <w:t>Cinco preguntas reales de su trabajo, correctas · role play donde ella dirige con preguntas.</w:t>
+              <w:t>5 preguntas reales de su trabajo, correctas · role play donde ella conduce con preguntas · mejora del word order en producción espontánea.</w:t>
             </w:r>
           </w:p>
         </w:tc>
@@ -5127,7 +5220,7 @@
           <w:color w:val="C68C6C"/>
           <w:sz w:val="17"/>
         </w:rPr>
-        <w:t>MICROENSEÑANZA · 5–10 MIN (SI NO VIO LA PLATAFORMA)</w:t>
+        <w:t>MICROENSEÑANZA · 5–10 MIN · OBLIGATORIA SI LA CLASE TODAVÍA NO ESTÁ DISPONIBLE</w:t>
       </w:r>
     </w:p>
     <w:p>
@@ -5151,7 +5244,15 @@
         <w:pStyle w:val="ListBullet"/>
       </w:pPr>
       <w:r>
-        <w:t>Orden de la frase: sujeto + verbo + objeto + lugar + tiempo; el adjetivo va antes del sustantivo.</w:t>
+        <w:t>Orden de la frase: sujeto + verbo + objeto + lugar + tiempo.</w:t>
+      </w:r>
+    </w:p>
+    <w:p>
+      <w:pPr>
+        <w:pStyle w:val="ListBullet"/>
+      </w:pPr>
+      <w:r>
+        <w:t>Evitar la traducción directa de patrones del español.</w:t>
       </w:r>
     </w:p>
     <w:p>
@@ -5174,7 +5275,7 @@
           <w:b w:val="0"/>
           <w:i w:val="0"/>
         </w:rPr>
-        <w:t>Belén le pregunta al proveedor por documentación pendiente. Sol le pide información a otro equipo. Virginia hace preguntas de seguimiento a su equipo.</w:t>
+        <w:t>Preguntas de clarificación, de seguimiento y de diagnóstico. Belén le pregunta al proveedor por documentación pendiente. Sol le pide información a otro equipo. Virginia hace preguntas de seguimiento a su equipo.</w:t>
       </w:r>
     </w:p>
     <w:p>
@@ -5220,7 +5321,7 @@
           <w:b w:val="0"/>
           <w:i w:val="0"/>
         </w:rPr>
-        <w:t>Preparar las preguntas de una reunión real y usarlas.</w:t>
+        <w:t>Preparar 5 preguntas reales que va a necesitar esa semana y practicar variaciones.</w:t>
       </w:r>
     </w:p>
     <w:p>
@@ -5272,7 +5373,7 @@
           <w:color w:val="81552E"/>
           <w:sz w:val="40"/>
         </w:rPr>
-        <w:t>Modals &amp; Functional Accuracy</w:t>
+        <w:t>Modals for Professional Communication</w:t>
       </w:r>
     </w:p>
     <w:tbl>
@@ -5322,7 +5423,7 @@
                 <w:i w:val="0"/>
                 <w:sz w:val="20"/>
               </w:rPr>
-              <w:t>Pedir, sugerir, recomendar, marcar obligación y suavizar con modales.</w:t>
+              <w:t>Controlar posibilidad, certeza, obligación, recomendación, pedidos y pushback con la fuerza adecuada.</w:t>
             </w:r>
           </w:p>
         </w:tc>
@@ -5341,7 +5442,7 @@
                 <w:color w:val="81552E"/>
                 <w:sz w:val="19"/>
               </w:rPr>
-              <w:t>Apoyo en plataforma</w:t>
+              <w:t>En la plataforma</w:t>
             </w:r>
           </w:p>
         </w:tc>
@@ -5356,7 +5457,7 @@
                 <w:i w:val="0"/>
                 <w:sz w:val="20"/>
               </w:rPr>
-              <w:t>M3.3 Modals.</w:t>
+              <w:t>M3.3 Modals for Professional Communication (todavía no creada)</w:t>
             </w:r>
           </w:p>
         </w:tc>
@@ -5390,7 +5491,7 @@
                 <w:i w:val="0"/>
                 <w:sz w:val="20"/>
               </w:rPr>
-              <w:t>Usa modales para pedir, recomendar, marcar obligación y suavizar sin sonar brusca ni ambigua.</w:t>
+              <w:t>Ajusta el modal a la certeza o la fuerza que quiere comunicar: puede pedir, recomendar o hacer pushback sin sonar ni brusca ni vaga.</w:t>
             </w:r>
           </w:p>
         </w:tc>
@@ -5424,7 +5525,7 @@
                 <w:i w:val="0"/>
                 <w:sz w:val="20"/>
               </w:rPr>
-              <w:t>Un pedido, una recomendación y un límite en la misma interacción, con el modal adecuado.</w:t>
+              <w:t>Un pedido, una recomendación y un límite en la misma interacción, con el modal adecuado · puede explicar por qué eligió esa fuerza.</w:t>
             </w:r>
           </w:p>
         </w:tc>
@@ -5465,7 +5566,7 @@
           <w:color w:val="C68C6C"/>
           <w:sz w:val="17"/>
         </w:rPr>
-        <w:t>MICROENSEÑANZA · 5–10 MIN (SI NO VIO LA PLATAFORMA)</w:t>
+        <w:t>MICROENSEÑANZA · 5–10 MIN · OBLIGATORIA SI LA CLASE TODAVÍA NO ESTÁ DISPONIBLE</w:t>
       </w:r>
     </w:p>
     <w:p>
@@ -5473,7 +5574,7 @@
         <w:pStyle w:val="ListBullet"/>
       </w:pPr>
       <w:r>
-        <w:t>Pedir: could / would you. Recomendar: should / I'd recommend.</w:t>
+        <w:t>Certeza y posibilidad: will / should / might / could.</w:t>
       </w:r>
     </w:p>
     <w:p>
@@ -5481,7 +5582,7 @@
         <w:pStyle w:val="ListBullet"/>
       </w:pPr>
       <w:r>
-        <w:t>Obligación: need to / have to / must. Posibilidad: might / could.</w:t>
+        <w:t>Obligación y recomendación: must / have to / need to / should / I'd recommend.</w:t>
       </w:r>
     </w:p>
     <w:p>
@@ -5489,7 +5590,15 @@
         <w:pStyle w:val="ListBullet"/>
       </w:pPr>
       <w:r>
-        <w:t>Suavizar: «It might be better to…», «Would it be possible to…?».</w:t>
+        <w:t>Pedidos y sugerencias: could you / would you / would it be possible to…?</w:t>
+      </w:r>
+    </w:p>
+    <w:p>
+      <w:pPr>
+        <w:pStyle w:val="ListBullet"/>
+      </w:pPr>
+      <w:r>
+        <w:t>La escala de fuerza: la misma idea dicha de más suave a más firme.</w:t>
       </w:r>
     </w:p>
     <w:p>
@@ -5512,7 +5621,7 @@
           <w:b w:val="0"/>
           <w:i w:val="0"/>
         </w:rPr>
-        <w:t>Belén: pedirle al proveedor que cumpla un plazo, firme pero cordial. Sol: pedir más recursos. Virginia: recomendarle una decisión al CEO.</w:t>
+        <w:t>Belén: pedirle al proveedor que cumpla un plazo, firme pero cordial. Sol: pedir más recursos. Virginia: recomendarle una decisión al CEO con el nivel de certeza correcto.</w:t>
       </w:r>
     </w:p>
     <w:p>
@@ -5558,7 +5667,7 @@
           <w:b w:val="0"/>
           <w:i w:val="0"/>
         </w:rPr>
-        <w:t>Usar un pedido y una recomendación en una situación real y contarlo en el Weekly Report.</w:t>
+        <w:t>Decir 3 mensajes reales con distintos grados de fuerza y elegir el más adecuado para cada uno.</w:t>
       </w:r>
     </w:p>
     <w:p>
@@ -5610,7 +5719,7 @@
           <w:color w:val="81552E"/>
           <w:sz w:val="40"/>
         </w:rPr>
-        <w:t>Causas, condiciones y consecuencias + patrones de alta frecuencia</w:t>
+        <w:t>Causes, Conditions &amp; Consequences</w:t>
       </w:r>
     </w:p>
     <w:tbl>
@@ -5660,7 +5769,7 @@
                 <w:i w:val="0"/>
                 <w:sz w:val="20"/>
               </w:rPr>
-              <w:t>Explicar por qué pasa algo, qué pasa si, y qué implica; corregir sus patrones de alta frecuencia.</w:t>
+              <w:t>Expresar relaciones lógicas entre hechos, causas, condiciones, riesgos y consecuencias.</w:t>
             </w:r>
           </w:p>
         </w:tc>
@@ -5679,7 +5788,7 @@
                 <w:color w:val="81552E"/>
                 <w:sz w:val="19"/>
               </w:rPr>
-              <w:t>Apoyo en plataforma</w:t>
+              <w:t>En la plataforma</w:t>
             </w:r>
           </w:p>
         </w:tc>
@@ -5694,7 +5803,7 @@
                 <w:i w:val="0"/>
                 <w:sz w:val="20"/>
               </w:rPr>
-              <w:t>M3.4 Causes, Conditions &amp; Consequences · M3.5 High-Frequency Precision Patterns.</w:t>
+              <w:t>M3.4 Causes, Conditions &amp; Consequences (todavía no creada) · M3.5 High-Frequency Precision Patterns (todavía no creada)</w:t>
             </w:r>
           </w:p>
         </w:tc>
@@ -5728,7 +5837,7 @@
                 <w:i w:val="0"/>
                 <w:sz w:val="20"/>
               </w:rPr>
-              <w:t>Explica causas, condiciones y consecuencias con conectores precisos, y corrige su patrón de alta frecuencia prioritario.</w:t>
+              <w:t>Explica un problema o una decisión mostrando causa → impacto → acción, y construye un escenario condicional sin perder claridad.</w:t>
             </w:r>
           </w:p>
         </w:tc>
@@ -5762,7 +5871,7 @@
                 <w:i w:val="0"/>
                 <w:sz w:val="20"/>
               </w:rPr>
-              <w:t>Explicación de un problema real con because / due to, if / unless, so / as a result · su error de alta frecuencia baja visiblemente en el retry.</w:t>
+              <w:t>Explicación de un problema real con causa, impacto y acción · al menos un condicional bien construido · su patrón de alta frecuencia baja en el retry.</w:t>
             </w:r>
           </w:p>
         </w:tc>
@@ -5803,7 +5912,7 @@
           <w:color w:val="C68C6C"/>
           <w:sz w:val="17"/>
         </w:rPr>
-        <w:t>MICROENSEÑANZA · 5–10 MIN (SI NO VIO LA PLATAFORMA)</w:t>
+        <w:t>MICROENSEÑANZA · 5–10 MIN · OBLIGATORIA SI LA CLASE TODAVÍA NO ESTÁ DISPONIBLE</w:t>
       </w:r>
     </w:p>
     <w:p>
@@ -5835,7 +5944,7 @@
         <w:pStyle w:val="ListBullet"/>
       </w:pPr>
       <w:r>
-        <w:t>Su patrón de alta frecuencia (por ejemplo, la -s de tercera persona, artículos o in / on / at).</w:t>
+        <w:t>Sus patrones de alta frecuencia que aparezcan en la producción, sin convertir cada duda en una clase.</w:t>
       </w:r>
     </w:p>
     <w:p>
@@ -5858,7 +5967,7 @@
           <w:b w:val="0"/>
           <w:i w:val="0"/>
         </w:rPr>
-        <w:t>Sol: por qué se retrasa algo y qué pasa si no se resuelve. Virginia: el impacto de una decisión. Belén: qué pasa si el proveedor no completa un paso.</w:t>
+        <w:t>Riesgos, decisiones, problemas y next steps. Sol: por qué se retrasa algo y qué pasa si no se resuelve. Virginia: el impacto de una decisión. Belén: qué pasa si el proveedor no completa un paso.</w:t>
       </w:r>
     </w:p>
     <w:p>
@@ -5904,7 +6013,7 @@
           <w:b w:val="0"/>
           <w:i w:val="0"/>
         </w:rPr>
-        <w:t>Registrar su patrón de alta frecuencia en cada práctica de la semana.</w:t>
+        <w:t>Aplicar causa / condición / consecuencia a una situación real y hacer un retry oral.</w:t>
       </w:r>
     </w:p>
     <w:p>
@@ -5956,7 +6065,7 @@
           <w:color w:val="81552E"/>
           <w:sz w:val="40"/>
         </w:rPr>
-        <w:t>Integración de precisión</w:t>
+        <w:t>Precision Audit + integración</w:t>
       </w:r>
     </w:p>
     <w:tbl>
@@ -6006,7 +6115,7 @@
                 <w:i w:val="0"/>
                 <w:sz w:val="20"/>
               </w:rPr>
-              <w:t>Sostener la precisión en una situación real completa, bajo presión.</w:t>
+              <w:t>Cerrar Polish: identificar qué patrones de precisión todavía interfieren y sostenerlos en tiempo real.</w:t>
             </w:r>
           </w:p>
         </w:tc>
@@ -6025,7 +6134,7 @@
                 <w:color w:val="81552E"/>
                 <w:sz w:val="19"/>
               </w:rPr>
-              <w:t>Apoyo en plataforma</w:t>
+              <w:t>En la plataforma</w:t>
             </w:r>
           </w:p>
         </w:tc>
@@ -6040,7 +6149,7 @@
                 <w:i w:val="0"/>
                 <w:sz w:val="20"/>
               </w:rPr>
-              <w:t>Repaso de M3 (lo que corresponda a sus patrones).</w:t>
+              <w:t>Precision Library (según necesidad) · M3.5 High-Frequency Precision Patterns (todavía no creada)</w:t>
             </w:r>
           </w:p>
         </w:tc>
@@ -6074,7 +6183,7 @@
                 <w:i w:val="0"/>
                 <w:sz w:val="20"/>
               </w:rPr>
-              <w:t>Mantiene estables sus patrones prioritarios mientras habla en tiempo real, no solo cuando piensa en la gramática.</w:t>
+              <w:t>Mantiene estables sus 2–3 patrones prioritarios mientras habla en tiempo real, no solo cuando piensa en la gramática.</w:t>
             </w:r>
           </w:p>
         </w:tc>
@@ -6108,7 +6217,7 @@
                 <w:i w:val="0"/>
                 <w:sz w:val="20"/>
               </w:rPr>
-              <w:t>Comparación de la situación de la sesión 10 con la de hoy · lista actualizada: qué ya está resuelto y qué queda.</w:t>
+              <w:t>Mapa de patrones: estable / a vigilar / prioritario · mejora en al menos 2 patrones dentro de producción espontánea · comparación con la situación de la sesión 10.</w:t>
             </w:r>
           </w:p>
         </w:tc>
@@ -6142,7 +6251,7 @@
                 <w:i w:val="0"/>
                 <w:sz w:val="20"/>
               </w:rPr>
-              <w:t>Patrón prioritario estable. Si todavía no lo está, sigue como track transversal en las sesiones 17–19.</w:t>
+              <w:t>Mapa de patrones de precisión. Lo que sigue en «prioritario» pasa a ser track transversal en las sesiones 17–20.</w:t>
             </w:r>
           </w:p>
         </w:tc>
@@ -6183,7 +6292,7 @@
           <w:color w:val="C68C6C"/>
           <w:sz w:val="17"/>
         </w:rPr>
-        <w:t>MICROENSEÑANZA · 5–10 MIN (SI NO VIO LA PLATAFORMA)</w:t>
+        <w:t>MICROENSEÑANZA · 5–10 MIN · OBLIGATORIA SI LA CLASE TODAVÍA NO ESTÁ DISPONIBLE</w:t>
       </w:r>
     </w:p>
     <w:p>
@@ -6191,7 +6300,15 @@
         <w:pStyle w:val="ListBullet"/>
       </w:pPr>
       <w:r>
-        <w:t>No hay contenido nuevo: repaso de sus 2–3 patrones en tres minutos.</w:t>
+        <w:t>Chequeo rápido (no se enseña todo): articles, countability, prepositions, agreement, -ING / infinitive, passive, collocations, word families, nominalization, translation patterns. Solo se marcan los que aparecen en su evidencia.</w:t>
+      </w:r>
+    </w:p>
+    <w:p>
+      <w:pPr>
+        <w:pStyle w:val="ListBullet"/>
+      </w:pPr>
+      <w:r>
+        <w:t>Práctica focalizada solo en sus 2–3 patrones de mayor impacto.</w:t>
       </w:r>
     </w:p>
     <w:p>
@@ -6222,7 +6339,7 @@
           <w:b w:val="0"/>
           <w:i w:val="0"/>
         </w:rPr>
-        <w:t>Repite la situación del hito de la sesión 10, o una equivalente, completa.</w:t>
+        <w:t>Repite la situación del hito de la sesión 10, o una equivalente, integrando verbos, preguntas, modales y relaciones lógicas.</w:t>
       </w:r>
     </w:p>
     <w:p>
@@ -6245,7 +6362,7 @@
           <w:b w:val="0"/>
           <w:i w:val="0"/>
         </w:rPr>
-        <w:t>Una segunda vuelta más rápida. Presión: interrupciones y preguntas.</w:t>
+        <w:t>Retry final de Polish, más rápido. Presión: interrupciones y preguntas.</w:t>
       </w:r>
     </w:p>
     <w:p>
@@ -6268,7 +6385,7 @@
           <w:b w:val="0"/>
           <w:i w:val="0"/>
         </w:rPr>
-        <w:t>Sus patrones pasan a ser un track transversal: los registra en el Weekly Report.</w:t>
+        <w:t>Practicar solo los patrones prioritarios y llevarlos a una situación laboral real.</w:t>
       </w:r>
     </w:p>
     <w:p>
@@ -6296,7 +6413,7 @@
           <w:color w:val="81552E"/>
           <w:sz w:val="40"/>
         </w:rPr>
-        <w:t>Pronunciación para ser entendida</w:t>
+        <w:t>How English Really Sounds + Train Your Ear</w:t>
       </w:r>
     </w:p>
     <w:tbl>
@@ -6346,7 +6463,7 @@
                 <w:i w:val="0"/>
                 <w:sz w:val="20"/>
               </w:rPr>
-              <w:t>Hacerse entender: acento de palabra, énfasis en lo importante, pausas y los sonidos que cambian el significado.</w:t>
+              <w:t>Reconocer el inglés real y dejar de esperar una pronunciación palabra por palabra.</w:t>
             </w:r>
           </w:p>
         </w:tc>
@@ -6365,7 +6482,7 @@
                 <w:color w:val="81552E"/>
                 <w:sz w:val="19"/>
               </w:rPr>
-              <w:t>Apoyo en plataforma</w:t>
+              <w:t>En la plataforma</w:t>
             </w:r>
           </w:p>
         </w:tc>
@@ -6380,7 +6497,7 @@
                 <w:i w:val="0"/>
                 <w:sz w:val="20"/>
               </w:rPr>
-              <w:t>M4.2 Pronunciation for Intelligibility · M4.1 How English Really Sounds.</w:t>
+              <w:t>M4.1 How English Really Sounds (en desarrollo) · M4.3 Train Your Ear (todavía no creada)</w:t>
             </w:r>
           </w:p>
         </w:tc>
@@ -6414,7 +6531,7 @@
                 <w:i w:val="0"/>
                 <w:sz w:val="20"/>
               </w:rPr>
-              <w:t>Se hace entender sin esfuerzo del oyente en las palabras clave de su trabajo y marca el mensaje principal con énfasis y pausas.</w:t>
+              <w:t>Entiende la idea principal y más detalles en la segunda escucha, y reconoce fenómenos de connected speech.</w:t>
             </w:r>
           </w:p>
         </w:tc>
@@ -6448,7 +6565,7 @@
                 <w:i w:val="0"/>
                 <w:sz w:val="20"/>
               </w:rPr>
-              <w:t>Diez palabras clave de su trabajo con el acento correcto · update grabado con pausas por bloques de sentido y énfasis en la información nueva.</w:t>
+              <w:t>Main point + más detalles en la segunda escucha que en la primera · señala al menos 2 fenómenos de connected speech en el audio.</w:t>
             </w:r>
           </w:p>
         </w:tc>
@@ -6475,7 +6592,7 @@
           <w:i/>
           <w:color w:val="8A6A55"/>
         </w:rPr>
-        <w:t>«Estamos en Understand &amp; Be Understood. Hoy el foco es que te entiendan sin esfuerzo. Al terminar, vas a poder marcar tu mensaje con énfasis y pausas.»</w:t>
+        <w:t>«Estamos en Understand &amp; Be Understood. Hoy el foco es entender el inglés como se habla de verdad. Al terminar, vas a poder seguir una conversación real sin perder lo importante.»</w:t>
       </w:r>
     </w:p>
     <w:p>
@@ -6489,7 +6606,7 @@
           <w:color w:val="C68C6C"/>
           <w:sz w:val="17"/>
         </w:rPr>
-        <w:t>MICROENSEÑANZA · 5–10 MIN (SI NO VIO LA PLATAFORMA)</w:t>
+        <w:t>MICROENSEÑANZA · 5–10 MIN · OBLIGATORIA SI LA CLASE TODAVÍA NO ESTÁ DISPONIBLE</w:t>
       </w:r>
     </w:p>
     <w:p>
@@ -6497,7 +6614,7 @@
         <w:pStyle w:val="ListBullet"/>
       </w:pPr>
       <w:r>
-        <w:t>El objetivo es ser entendida, no sonar nativa.</w:t>
+        <w:t>Por qué no entiende aunque conozca las palabras: linking (turn it off), reductions (gonna, wanna), formas débiles (to, for, of), stress y rhythm.</w:t>
       </w:r>
     </w:p>
     <w:p>
@@ -6505,7 +6622,7 @@
         <w:pStyle w:val="ListBullet"/>
       </w:pPr>
       <w:r>
-        <w:t>Word stress en sus palabras clave. Sentence stress: énfasis en lo nuevo o importante.</w:t>
+        <w:t>Ciclo de escucha: Listen → Main Point → Detail → Inspect → Listen Again → Respond.</w:t>
       </w:r>
     </w:p>
     <w:p>
@@ -6513,15 +6630,7 @@
         <w:pStyle w:val="ListBullet"/>
       </w:pPr>
       <w:r>
-        <w:t>Pausas por bloques de sentido.</w:t>
-      </w:r>
-    </w:p>
-    <w:p>
-      <w:pPr>
-        <w:pStyle w:val="ListBullet"/>
-      </w:pPr>
-      <w:r>
-        <w:t>Los 1–2 sonidos que, en su caso, cambian el significado (-ed, -s, vocales largas y cortas…).</w:t>
+        <w:t>En una reunión: confirmar lo que entendió en lugar de pedir que repitan todo.</w:t>
       </w:r>
     </w:p>
     <w:p>
@@ -6544,7 +6653,7 @@
           <w:b w:val="0"/>
           <w:i w:val="0"/>
         </w:rPr>
-        <w:t>Sus palabras clave. Belén: vendor, compliance, onboarding. Sol: deliverable, timeline, schedule. Virginia: revenue, forecast, quarterly.</w:t>
+        <w:t>Un audio de su contexto: una reunión real (si puede compartirla) o un video de su industria, con los acentos con los que trabaja.</w:t>
       </w:r>
     </w:p>
     <w:p>
@@ -6567,7 +6676,7 @@
           <w:b w:val="0"/>
           <w:i w:val="0"/>
         </w:rPr>
-        <w:t>El mismo update, con pausas y énfasis marcados. Presión: a velocidad normal de reunión.</w:t>
+        <w:t>Segunda escucha para completar lo que faltó; después responde como si estuviera en la reunión.</w:t>
       </w:r>
     </w:p>
     <w:p>
@@ -6590,7 +6699,7 @@
           <w:b w:val="0"/>
           <w:i w:val="0"/>
         </w:rPr>
-        <w:t>Shadowing de un minuto de su propio update corregido. Grabarse.</w:t>
+        <w:t>Una práctica corta de listening deliberado con el ciclo completo, con notas guardadas como evidencia.</w:t>
       </w:r>
     </w:p>
     <w:p>
@@ -6614,7 +6723,7 @@
           <w:i/>
           <w:color w:val="8A6A55"/>
         </w:rPr>
-        <w:t>Trabajar entonación en preguntas y en recomendaciones.</w:t>
+        <w:t>Audios más rápidos o con acentos que le cuestan.</w:t>
       </w:r>
     </w:p>
     <w:p>
@@ -6642,7 +6751,7 @@
           <w:color w:val="81552E"/>
           <w:sz w:val="40"/>
         </w:rPr>
-        <w:t>Entrenar el oído</w:t>
+        <w:t>Pronunciation for Intelligibility + Shadowing</w:t>
       </w:r>
     </w:p>
     <w:tbl>
@@ -6692,7 +6801,7 @@
                 <w:i w:val="0"/>
                 <w:sz w:val="20"/>
               </w:rPr>
-              <w:t>Entender inglés hablado real: formas débiles, uniones, reducciones y acentos distintos.</w:t>
+              <w:t>Mejorar los patrones de pronunciación que más afectan cuánto le cuesta al otro entenderla.</w:t>
             </w:r>
           </w:p>
         </w:tc>
@@ -6711,7 +6820,7 @@
                 <w:color w:val="81552E"/>
                 <w:sz w:val="19"/>
               </w:rPr>
-              <w:t>Apoyo en plataforma</w:t>
+              <w:t>En la plataforma</w:t>
             </w:r>
           </w:p>
         </w:tc>
@@ -6726,7 +6835,7 @@
                 <w:i w:val="0"/>
                 <w:sz w:val="20"/>
               </w:rPr>
-              <w:t>M4.3 Train Your Ear · M4.1 How English Really Sounds.</w:t>
+              <w:t>M4.2 Pronunciation for Intelligibility (todavía no creada) · M4.4 Shadowing: Train Your Ear &amp; Mouth (todavía no creada)</w:t>
             </w:r>
           </w:p>
         </w:tc>
@@ -6760,7 +6869,7 @@
                 <w:i w:val="0"/>
                 <w:sz w:val="20"/>
               </w:rPr>
-              <w:t>Entiende la idea principal y los detalles clave de un audio real de su área, y reconoce formas reducidas.</w:t>
+              <w:t>Transfiere al menos un patrón de pronunciación trabajado a frases propias de su trabajo.</w:t>
             </w:r>
           </w:p>
         </w:tc>
@@ -6794,7 +6903,7 @@
                 <w:i w:val="0"/>
                 <w:sz w:val="20"/>
               </w:rPr>
-              <w:t>Resumen oral de un audio real (idea principal + dos detalles) · dictado corto de frases con connected speech.</w:t>
+              <w:t>Grabación antes / después de un mismo mensaje · reproduce y transfiere al menos un patrón.</w:t>
             </w:r>
           </w:p>
         </w:tc>
@@ -6821,7 +6930,7 @@
           <w:i/>
           <w:color w:val="8A6A55"/>
         </w:rPr>
-        <w:t>«Estamos en Understand &amp; Be Understood. Hoy el foco es entender el inglés como se habla de verdad. Al terminar, vas a poder seguir una conversación real sin perder lo importante.»</w:t>
+        <w:t>«Estamos en Understand &amp; Be Understood. Hoy el foco es que te entiendan sin esfuerzo. Al terminar, vas a poder marcar tu mensaje con énfasis, ritmo y pausas.»</w:t>
       </w:r>
     </w:p>
     <w:p>
@@ -6835,7 +6944,7 @@
           <w:color w:val="C68C6C"/>
           <w:sz w:val="17"/>
         </w:rPr>
-        <w:t>MICROENSEÑANZA · 5–10 MIN (SI NO VIO LA PLATAFORMA)</w:t>
+        <w:t>MICROENSEÑANZA · 5–10 MIN · OBLIGATORIA SI LA CLASE TODAVÍA NO ESTÁ DISPONIBLE</w:t>
       </w:r>
     </w:p>
     <w:p>
@@ -6843,7 +6952,7 @@
         <w:pStyle w:val="ListBullet"/>
       </w:pPr>
       <w:r>
-        <w:t>Por qué no entiende aunque conozca las palabras: formas débiles (to, for, and, of), uniones (turn it off), reducciones (gonna, wanna, kinda).</w:t>
+        <w:t>El objetivo es ser entendida, no sonar nativa.</w:t>
       </w:r>
     </w:p>
     <w:p>
@@ -6851,7 +6960,7 @@
         <w:pStyle w:val="ListBullet"/>
       </w:pPr>
       <w:r>
-        <w:t>Primero la idea, después el detalle.</w:t>
+        <w:t>Diagnóstico individual: word stress, sentence stress, ritmo, linking, finales (-ed, -s) o los sonidos que en su caso cambian el significado.</w:t>
       </w:r>
     </w:p>
     <w:p>
@@ -6859,7 +6968,15 @@
         <w:pStyle w:val="ListBullet"/>
       </w:pPr>
       <w:r>
-        <w:t>En una reunión: confirmar lo que entendió en lugar de pedir que repitan todo.</w:t>
+        <w:t>Shadowing: escuchar y repetir en simultáneo imitando ritmo y entonación.</w:t>
+      </w:r>
+    </w:p>
+    <w:p>
+      <w:pPr>
+        <w:pStyle w:val="ListBullet"/>
+      </w:pPr>
+      <w:r>
+        <w:t>Record → compare → adjust → record again.</w:t>
       </w:r>
     </w:p>
     <w:p>
@@ -6882,7 +6999,7 @@
           <w:b w:val="0"/>
           <w:i w:val="0"/>
         </w:rPr>
-        <w:t>Un audio de su contexto: la grabación de una reunión real (si puede compartirla) o un video de su industria, con los acentos con los que trabaja.</w:t>
+        <w:t>Sus palabras y frases clave. Belén: vendor, compliance, onboarding. Sol: deliverable, timeline, schedule. Virginia: revenue, forecast, quarterly.</w:t>
       </w:r>
     </w:p>
     <w:p>
@@ -6905,7 +7022,7 @@
           <w:b w:val="0"/>
           <w:i w:val="0"/>
         </w:rPr>
-        <w:t>Segunda escucha para completar lo que faltó; después responde como si estuviera en la reunión.</w:t>
+        <w:t>El mismo mensaje con el patrón corregido. Presión: a velocidad normal de reunión.</w:t>
       </w:r>
     </w:p>
     <w:p>
@@ -6928,7 +7045,7 @@
           <w:b w:val="0"/>
           <w:i w:val="0"/>
         </w:rPr>
-        <w:t>Diez minutos diarios de escucha de su área + un resumen de 30 segundos.</w:t>
+        <w:t>Shadowing breve + grabar un mensaje propio con 1–2 focos de inteligibilidad.</w:t>
       </w:r>
     </w:p>
     <w:p>
@@ -6952,7 +7069,7 @@
           <w:i/>
           <w:color w:val="8A6A55"/>
         </w:rPr>
-        <w:t>Audios más rápidos o con acentos que le cuestan.</w:t>
+        <w:t>Trabajar entonación en preguntas y recomendaciones.</w:t>
       </w:r>
     </w:p>
     <w:p>
@@ -6980,7 +7097,7 @@
           <w:color w:val="81552E"/>
           <w:sz w:val="40"/>
         </w:rPr>
-        <w:t>Escuchar y responder en tiempo real</w:t>
+        <w:t>Real-Time Listening + Speaking</w:t>
       </w:r>
     </w:p>
     <w:tbl>
@@ -7030,7 +7147,7 @@
                 <w:i w:val="0"/>
                 <w:sz w:val="20"/>
               </w:rPr>
-              <w:t>Escuchar, procesar y responder en tiempo real; shadowing para ritmo y fluidez.</w:t>
+              <w:t>Integrar comprensión, inteligibilidad y respuesta en una interacción laboral completa.</w:t>
             </w:r>
           </w:p>
         </w:tc>
@@ -7049,7 +7166,7 @@
                 <w:color w:val="81552E"/>
                 <w:sz w:val="19"/>
               </w:rPr>
-              <w:t>Apoyo en plataforma</w:t>
+              <w:t>En la plataforma</w:t>
             </w:r>
           </w:p>
         </w:tc>
@@ -7064,7 +7181,7 @@
                 <w:i w:val="0"/>
                 <w:sz w:val="20"/>
               </w:rPr>
-              <w:t>M4.4 Shadowing.</w:t>
+              <w:t>Workplace Guides (en desarrollo) · Revisión integrada M1–M4</w:t>
             </w:r>
           </w:p>
         </w:tc>
@@ -7098,7 +7215,7 @@
                 <w:i w:val="0"/>
                 <w:sz w:val="20"/>
               </w:rPr>
-              <w:t>Escucha una intervención real, confirma lo que entendió y responde con estructura, sin pedir que le repitan todo.</w:t>
+              <w:t>Escucha una intervención real, extrae lo importante, confirma lo que entendió y responde con estructura, precisión e inteligibilidad.</w:t>
             </w:r>
           </w:p>
         </w:tc>
@@ -7132,7 +7249,7 @@
                 <w:i w:val="0"/>
                 <w:sz w:val="20"/>
               </w:rPr>
-              <w:t>Role play de reunión donde escucha, parafrasea («So what you're saying is…») y responde con estructura · audio de shadowing antes y después.</w:t>
+              <w:t>Interacción completa con input auditivo + respuesta + follow-up · puede decir qué capacidades ya son autónomas y cuáles todavía necesitan apoyo.</w:t>
             </w:r>
           </w:p>
         </w:tc>
@@ -7173,7 +7290,7 @@
           <w:color w:val="C68C6C"/>
           <w:sz w:val="17"/>
         </w:rPr>
-        <w:t>MICROENSEÑANZA · 5–10 MIN (SI NO VIO LA PLATAFORMA)</w:t>
+        <w:t>MICROENSEÑANZA · 5–10 MIN · OBLIGATORIA SI LA CLASE TODAVÍA NO ESTÁ DISPONIBLE</w:t>
       </w:r>
     </w:p>
     <w:p>
@@ -7181,7 +7298,7 @@
         <w:pStyle w:val="ListBullet"/>
       </w:pPr>
       <w:r>
-        <w:t>Shadowing: escuchar y repetir en simultáneo imitando ritmo y entonación, en tres rondas.</w:t>
+        <w:t>Escuchar sin transcript y extraer main point / action / risk.</w:t>
       </w:r>
     </w:p>
     <w:p>
@@ -7189,7 +7306,7 @@
         <w:pStyle w:val="ListBullet"/>
       </w:pPr>
       <w:r>
-        <w:t>Escuchar → confirmar → responder.</w:t>
+        <w:t>Escuchar → confirmar → responder: «If I understand correctly…», «So what you're saying is…».</w:t>
       </w:r>
     </w:p>
     <w:p>
@@ -7197,7 +7314,7 @@
         <w:pStyle w:val="ListBullet"/>
       </w:pPr>
       <w:r>
-        <w:t>Chunks: «If I understand correctly…», «Just to make sure…».</w:t>
+        <w:t>Usar lo de Communicate (estructura), Polish (sus patrones) y Understand (inteligibilidad) sin sobrecontrolarse.</w:t>
       </w:r>
     </w:p>
     <w:p>
@@ -7220,7 +7337,7 @@
           <w:b w:val="0"/>
           <w:i w:val="0"/>
         </w:rPr>
-        <w:t>Reunión simulada de su contexto. Virginia recibe feedback del CEO y responde. Sol recibe un cambio de prioridad. Belén: el proveedor pone una objeción.</w:t>
+        <w:t>Reunión simulada completa con variaciones, interrupciones y follow-up. Virginia recibe feedback del CEO y responde. Sol recibe un cambio de prioridad. Belén: el proveedor pone una objeción.</w:t>
       </w:r>
     </w:p>
     <w:p>
@@ -7266,7 +7383,7 @@
           <w:b w:val="0"/>
           <w:i w:val="0"/>
         </w:rPr>
-        <w:t>Preparar la sesión 20: elegir la situación final y volver a grabar la consigna del Starting Point.</w:t>
+        <w:t>Preparar la sesión 20: volver a grabar la consigna del Starting Point y elegir 3 evidencias del proceso.</w:t>
       </w:r>
     </w:p>
     <w:p>
@@ -7318,7 +7435,7 @@
           <w:color w:val="81552E"/>
           <w:sz w:val="40"/>
         </w:rPr>
-        <w:t>Offboarding · review final e integración</w:t>
+        <w:t>Offboarding · Before → After → Next Level</w:t>
       </w:r>
     </w:p>
     <w:tbl>
@@ -7368,7 +7485,7 @@
                 <w:i w:val="0"/>
                 <w:sz w:val="20"/>
               </w:rPr>
-              <w:t>Integrar todo y medir el cambio con evidencia.</w:t>
+              <w:t>Cerrar el ciclo AT WORK con evidencia, consolidar su autonomía y definir el siguiente nivel.</w:t>
             </w:r>
           </w:p>
         </w:tc>
@@ -7387,7 +7504,7 @@
                 <w:color w:val="81552E"/>
                 <w:sz w:val="19"/>
               </w:rPr>
-              <w:t>Apoyo en plataforma</w:t>
+              <w:t>En la plataforma</w:t>
             </w:r>
           </w:p>
         </w:tc>
@@ -7402,7 +7519,7 @@
                 <w:i w:val="0"/>
                 <w:sz w:val="20"/>
               </w:rPr>
-              <w:t>Starting Point + carpeta 05 · MI PROGRESO + recurso «Tu recorrido AT WORK».</w:t>
+              <w:t>Starting Point + Weekly Reports + Wins · Recurso «Tu recorrido AT WORK» (listo)</w:t>
             </w:r>
           </w:p>
         </w:tc>
@@ -7436,7 +7553,7 @@
                 <w:i w:val="0"/>
                 <w:sz w:val="20"/>
               </w:rPr>
-              <w:t>Compara su punto de partida con el actual, reconoce lo que ya hace sola y define su siguiente nivel y su plan de práctica autónoma.</w:t>
+              <w:t>Compara su punto de partida con el actual, nombra qué capacidades quedaron instaladas y sale con un plan de 90 días.</w:t>
             </w:r>
           </w:p>
         </w:tc>
@@ -7470,7 +7587,7 @@
                 <w:i w:val="0"/>
                 <w:sz w:val="20"/>
               </w:rPr>
-              <w:t>Starting Point vs producción final (misma consigna, 2–3 min) · situación real final completa · plan de práctica autónoma.</w:t>
+              <w:t>Muestra final comparable con el Starting Point · resumen Before → After basado en evidencia · plan de 90 días.</w:t>
             </w:r>
           </w:p>
         </w:tc>
@@ -7511,7 +7628,7 @@
           <w:color w:val="C68C6C"/>
           <w:sz w:val="17"/>
         </w:rPr>
-        <w:t>MICROENSEÑANZA · 5–10 MIN (SI NO VIO LA PLATAFORMA)</w:t>
+        <w:t>MICROENSEÑANZA · 5–10 MIN · SI NO VIO LA CLASE</w:t>
       </w:r>
     </w:p>
     <w:p>
@@ -7542,7 +7659,7 @@
           <w:b w:val="0"/>
           <w:i w:val="0"/>
         </w:rPr>
-        <w:t>Una situación real final completa (update + preguntas) usando todo: estructura, precisión e inteligibilidad. Después escuchan juntas el audio del Starting Point y el de hoy.</w:t>
+        <w:t>Repite una tarea comparable al Starting Point, sin guion. Escuchan juntas el audio del Starting Point y el de hoy, y revisan Weekly Reports, wins y situaciones reales como evidencia. Identifican 2–3 gaps que todavía necesitan trabajo.</w:t>
       </w:r>
     </w:p>
     <w:p>
@@ -7588,7 +7705,1006 @@
           <w:b w:val="0"/>
           <w:i w:val="0"/>
         </w:rPr>
-        <w:t>Plan de práctica autónoma y su siguiente nivel: qué seguir entrenando después de AT WORK.</w:t>
+        <w:t>Plan de 90 días: qué mantener, qué seguir entrenando y cómo hacerlo de forma autónoma. Si hay una necesidad real, el siguiente nivel de acompañamiento. Pedir feedback o testimonio si corresponde.</w:t>
+      </w:r>
+    </w:p>
+    <w:p>
+      <w:r>
+        <w:br w:type="page"/>
+      </w:r>
+    </w:p>
+    <w:p>
+      <w:r>
+        <w:rPr>
+          <w:b/>
+          <w:i w:val="0"/>
+          <w:color w:val="C68C6C"/>
+          <w:sz w:val="18"/>
+        </w:rPr>
+        <w:t>ANEXOS</w:t>
+      </w:r>
+    </w:p>
+    <w:p>
+      <w:r>
+        <w:rPr>
+          <w:rFonts w:ascii="Source Serif Pro" w:hAnsi="Source Serif Pro" w:eastAsia="Source Serif Pro"/>
+          <w:b/>
+          <w:i w:val="0"/>
+          <w:color w:val="81552E"/>
+          <w:sz w:val="40"/>
+        </w:rPr>
+        <w:t>Coverage Matrix</w:t>
+      </w:r>
+    </w:p>
+    <w:p>
+      <w:r>
+        <w:rPr>
+          <w:b w:val="0"/>
+          <w:i/>
+          <w:color w:val="8A6A55"/>
+        </w:rPr>
+        <w:t>Control de que ninguna habilidad esencial dependa de haber visto un video.</w:t>
+      </w:r>
+    </w:p>
+    <w:tbl>
+      <w:tblPr>
+        <w:tblW w:type="auto" w:w="0"/>
+        <w:tblBorders>
+          <w:top w:val="single" w:sz="4" w:color="EDE5CC"/>
+          <w:left w:val="single" w:sz="4" w:color="EDE5CC"/>
+          <w:bottom w:val="single" w:sz="4" w:color="EDE5CC"/>
+          <w:right w:val="single" w:sz="4" w:color="EDE5CC"/>
+          <w:insideH w:val="single" w:sz="4" w:color="EDE5CC"/>
+          <w:insideV w:val="single" w:sz="4" w:color="EDE5CC"/>
+        </w:tblBorders>
+        <w:tblLayout w:type="fixed"/>
+        <w:tblLook w:firstColumn="1" w:firstRow="1" w:lastColumn="0" w:lastRow="0" w:noHBand="0" w:noVBand="1" w:val="04A0"/>
+      </w:tblPr>
+      <w:tblGrid>
+        <w:gridCol w:w="6009"/>
+        <w:gridCol w:w="3402"/>
+      </w:tblGrid>
+      <w:tr>
+        <w:tc>
+          <w:tcPr>
+            <w:tcW w:type="dxa" w:w="6009"/>
+          </w:tcPr>
+          <w:p>
+            <w:r>
+              <w:rPr>
+                <w:b w:val="0"/>
+                <w:i w:val="0"/>
+                <w:sz w:val="19"/>
+              </w:rPr>
+              <w:t>Onboarding, Roadmap, How We Work, Acuerdo, Ecosistema, Starting Point, Weekly System</w:t>
+            </w:r>
+          </w:p>
+        </w:tc>
+        <w:tc>
+          <w:tcPr>
+            <w:tcW w:type="dxa" w:w="3402"/>
+            <w:shd w:val="clear" w:color="auto" w:fill="FBF2D0"/>
+          </w:tcPr>
+          <w:p>
+            <w:r>
+              <w:rPr>
+                <w:b/>
+                <w:i w:val="0"/>
+                <w:color w:val="81552E"/>
+                <w:sz w:val="19"/>
+              </w:rPr>
+              <w:t>S1</w:t>
+            </w:r>
+          </w:p>
+        </w:tc>
+      </w:tr>
+      <w:tr>
+        <w:tc>
+          <w:tcPr>
+            <w:tcW w:type="dxa" w:w="6009"/>
+          </w:tcPr>
+          <w:p>
+            <w:r>
+              <w:rPr>
+                <w:b w:val="0"/>
+                <w:i w:val="0"/>
+                <w:sz w:val="19"/>
+              </w:rPr>
+              <w:t>My Professional Context · Practice System · bots</w:t>
+            </w:r>
+          </w:p>
+        </w:tc>
+        <w:tc>
+          <w:tcPr>
+            <w:tcW w:type="dxa" w:w="3402"/>
+            <w:shd w:val="clear" w:color="auto" w:fill="FBF2D0"/>
+          </w:tcPr>
+          <w:p>
+            <w:r>
+              <w:rPr>
+                <w:b/>
+                <w:i w:val="0"/>
+                <w:color w:val="81552E"/>
+                <w:sz w:val="19"/>
+              </w:rPr>
+              <w:t>S1–S2</w:t>
+            </w:r>
+          </w:p>
+        </w:tc>
+      </w:tr>
+      <w:tr>
+        <w:tc>
+          <w:tcPr>
+            <w:tcW w:type="dxa" w:w="6009"/>
+          </w:tcPr>
+          <w:p>
+            <w:r>
+              <w:rPr>
+                <w:b w:val="0"/>
+                <w:i w:val="0"/>
+                <w:sz w:val="19"/>
+              </w:rPr>
+              <w:t>Role Play Method</w:t>
+            </w:r>
+          </w:p>
+        </w:tc>
+        <w:tc>
+          <w:tcPr>
+            <w:tcW w:type="dxa" w:w="3402"/>
+            <w:shd w:val="clear" w:color="auto" w:fill="FBF2D0"/>
+          </w:tcPr>
+          <w:p>
+            <w:r>
+              <w:rPr>
+                <w:b/>
+                <w:i w:val="0"/>
+                <w:color w:val="81552E"/>
+                <w:sz w:val="19"/>
+              </w:rPr>
+              <w:t>S2 · se reutiliza en S8, S9 y S19</w:t>
+            </w:r>
+          </w:p>
+        </w:tc>
+      </w:tr>
+      <w:tr>
+        <w:tc>
+          <w:tcPr>
+            <w:tcW w:type="dxa" w:w="6009"/>
+          </w:tcPr>
+          <w:p>
+            <w:r>
+              <w:rPr>
+                <w:b w:val="0"/>
+                <w:i w:val="0"/>
+                <w:sz w:val="19"/>
+              </w:rPr>
+              <w:t>Narrative Flow · Error Radar</w:t>
+            </w:r>
+          </w:p>
+        </w:tc>
+        <w:tc>
+          <w:tcPr>
+            <w:tcW w:type="dxa" w:w="3402"/>
+            <w:shd w:val="clear" w:color="auto" w:fill="FBF2D0"/>
+          </w:tcPr>
+          <w:p>
+            <w:r>
+              <w:rPr>
+                <w:b/>
+                <w:i w:val="0"/>
+                <w:color w:val="81552E"/>
+                <w:sz w:val="19"/>
+              </w:rPr>
+              <w:t>S3 · transversal</w:t>
+            </w:r>
+          </w:p>
+        </w:tc>
+      </w:tr>
+      <w:tr>
+        <w:tc>
+          <w:tcPr>
+            <w:tcW w:type="dxa" w:w="6009"/>
+          </w:tcPr>
+          <w:p>
+            <w:r>
+              <w:rPr>
+                <w:b w:val="0"/>
+                <w:i w:val="0"/>
+                <w:sz w:val="19"/>
+              </w:rPr>
+              <w:t>Color Method · Active Language</w:t>
+            </w:r>
+          </w:p>
+        </w:tc>
+        <w:tc>
+          <w:tcPr>
+            <w:tcW w:type="dxa" w:w="3402"/>
+            <w:shd w:val="clear" w:color="auto" w:fill="FBF2D0"/>
+          </w:tcPr>
+          <w:p>
+            <w:r>
+              <w:rPr>
+                <w:b/>
+                <w:i w:val="0"/>
+                <w:color w:val="81552E"/>
+                <w:sz w:val="19"/>
+              </w:rPr>
+              <w:t>S4 · transversal</w:t>
+            </w:r>
+          </w:p>
+        </w:tc>
+      </w:tr>
+      <w:tr>
+        <w:tc>
+          <w:tcPr>
+            <w:tcW w:type="dxa" w:w="6009"/>
+          </w:tcPr>
+          <w:p>
+            <w:r>
+              <w:rPr>
+                <w:b w:val="0"/>
+                <w:i w:val="0"/>
+                <w:sz w:val="19"/>
+              </w:rPr>
+              <w:t>Complete Practice Cycle · Retry</w:t>
+            </w:r>
+          </w:p>
+        </w:tc>
+        <w:tc>
+          <w:tcPr>
+            <w:tcW w:type="dxa" w:w="3402"/>
+            <w:shd w:val="clear" w:color="auto" w:fill="FBF2D0"/>
+          </w:tcPr>
+          <w:p>
+            <w:r>
+              <w:rPr>
+                <w:b/>
+                <w:i w:val="0"/>
+                <w:color w:val="81552E"/>
+                <w:sz w:val="19"/>
+              </w:rPr>
+              <w:t>S4 · en todas las sesiones</w:t>
+            </w:r>
+          </w:p>
+        </w:tc>
+      </w:tr>
+      <w:tr>
+        <w:tc>
+          <w:tcPr>
+            <w:tcW w:type="dxa" w:w="6009"/>
+          </w:tcPr>
+          <w:p>
+            <w:r>
+              <w:rPr>
+                <w:b w:val="0"/>
+                <w:i w:val="0"/>
+                <w:sz w:val="19"/>
+              </w:rPr>
+              <w:t>Purpose &amp; Key Message · Build Clear Sentences</w:t>
+            </w:r>
+          </w:p>
+        </w:tc>
+        <w:tc>
+          <w:tcPr>
+            <w:tcW w:type="dxa" w:w="3402"/>
+            <w:shd w:val="clear" w:color="auto" w:fill="FBF2D0"/>
+          </w:tcPr>
+          <w:p>
+            <w:r>
+              <w:rPr>
+                <w:b/>
+                <w:i w:val="0"/>
+                <w:color w:val="81552E"/>
+                <w:sz w:val="19"/>
+              </w:rPr>
+              <w:t>S5</w:t>
+            </w:r>
+          </w:p>
+        </w:tc>
+      </w:tr>
+      <w:tr>
+        <w:tc>
+          <w:tcPr>
+            <w:tcW w:type="dxa" w:w="6009"/>
+          </w:tcPr>
+          <w:p>
+            <w:r>
+              <w:rPr>
+                <w:b w:val="0"/>
+                <w:i w:val="0"/>
+                <w:sz w:val="19"/>
+              </w:rPr>
+              <w:t>Organize &amp; Prioritize · Main Point First · BLUF · Message Map</w:t>
+            </w:r>
+          </w:p>
+        </w:tc>
+        <w:tc>
+          <w:tcPr>
+            <w:tcW w:type="dxa" w:w="3402"/>
+            <w:shd w:val="clear" w:color="auto" w:fill="FBF2D0"/>
+          </w:tcPr>
+          <w:p>
+            <w:r>
+              <w:rPr>
+                <w:b/>
+                <w:i w:val="0"/>
+                <w:color w:val="81552E"/>
+                <w:sz w:val="19"/>
+              </w:rPr>
+              <w:t>S6</w:t>
+            </w:r>
+          </w:p>
+        </w:tc>
+      </w:tr>
+      <w:tr>
+        <w:tc>
+          <w:tcPr>
+            <w:tcW w:type="dxa" w:w="6009"/>
+          </w:tcPr>
+          <w:p>
+            <w:r>
+              <w:rPr>
+                <w:b w:val="0"/>
+                <w:i w:val="0"/>
+                <w:sz w:val="19"/>
+              </w:rPr>
+              <w:t>Flexible Frameworks · Keep Speaking When the Word Doesn't Come</w:t>
+            </w:r>
+          </w:p>
+        </w:tc>
+        <w:tc>
+          <w:tcPr>
+            <w:tcW w:type="dxa" w:w="3402"/>
+            <w:shd w:val="clear" w:color="auto" w:fill="FBF2D0"/>
+          </w:tcPr>
+          <w:p>
+            <w:r>
+              <w:rPr>
+                <w:b/>
+                <w:i w:val="0"/>
+                <w:color w:val="81552E"/>
+                <w:sz w:val="19"/>
+              </w:rPr>
+              <w:t>S7</w:t>
+            </w:r>
+          </w:p>
+        </w:tc>
+      </w:tr>
+      <w:tr>
+        <w:tc>
+          <w:tcPr>
+            <w:tcW w:type="dxa" w:w="6009"/>
+          </w:tcPr>
+          <w:p>
+            <w:r>
+              <w:rPr>
+                <w:b w:val="0"/>
+                <w:i w:val="0"/>
+                <w:sz w:val="19"/>
+              </w:rPr>
+              <w:t>Gain Time to Think · Repair &amp; Continue</w:t>
+            </w:r>
+          </w:p>
+        </w:tc>
+        <w:tc>
+          <w:tcPr>
+            <w:tcW w:type="dxa" w:w="3402"/>
+            <w:shd w:val="clear" w:color="auto" w:fill="FBF2D0"/>
+          </w:tcPr>
+          <w:p>
+            <w:r>
+              <w:rPr>
+                <w:b/>
+                <w:i w:val="0"/>
+                <w:color w:val="81552E"/>
+                <w:sz w:val="19"/>
+              </w:rPr>
+              <w:t>S8</w:t>
+            </w:r>
+          </w:p>
+        </w:tc>
+      </w:tr>
+      <w:tr>
+        <w:tc>
+          <w:tcPr>
+            <w:tcW w:type="dxa" w:w="6009"/>
+          </w:tcPr>
+          <w:p>
+            <w:r>
+              <w:rPr>
+                <w:b w:val="0"/>
+                <w:i w:val="0"/>
+                <w:sz w:val="19"/>
+              </w:rPr>
+              <w:t>Manage the Interaction · preguntas inesperadas · aclarar · pushback</w:t>
+            </w:r>
+          </w:p>
+        </w:tc>
+        <w:tc>
+          <w:tcPr>
+            <w:tcW w:type="dxa" w:w="3402"/>
+            <w:shd w:val="clear" w:color="auto" w:fill="FBF2D0"/>
+          </w:tcPr>
+          <w:p>
+            <w:r>
+              <w:rPr>
+                <w:b/>
+                <w:i w:val="0"/>
+                <w:color w:val="81552E"/>
+                <w:sz w:val="19"/>
+              </w:rPr>
+              <w:t>S9</w:t>
+            </w:r>
+          </w:p>
+        </w:tc>
+      </w:tr>
+      <w:tr>
+        <w:tc>
+          <w:tcPr>
+            <w:tcW w:type="dxa" w:w="6009"/>
+          </w:tcPr>
+          <w:p>
+            <w:r>
+              <w:rPr>
+                <w:b w:val="0"/>
+                <w:i w:val="0"/>
+                <w:sz w:val="19"/>
+              </w:rPr>
+              <w:t>Clear, Concise &amp; Specific · Workplace Practice Library (8 guías)</w:t>
+            </w:r>
+          </w:p>
+        </w:tc>
+        <w:tc>
+          <w:tcPr>
+            <w:tcW w:type="dxa" w:w="3402"/>
+            <w:shd w:val="clear" w:color="auto" w:fill="FBF2D0"/>
+          </w:tcPr>
+          <w:p>
+            <w:r>
+              <w:rPr>
+                <w:b/>
+                <w:i w:val="0"/>
+                <w:color w:val="81552E"/>
+                <w:sz w:val="19"/>
+              </w:rPr>
+              <w:t>S10 · guías aplicadas en S9–S19 según la situación</w:t>
+            </w:r>
+          </w:p>
+        </w:tc>
+      </w:tr>
+      <w:tr>
+        <w:tc>
+          <w:tcPr>
+            <w:tcW w:type="dxa" w:w="6009"/>
+          </w:tcPr>
+          <w:p>
+            <w:r>
+              <w:rPr>
+                <w:b w:val="0"/>
+                <w:i w:val="0"/>
+                <w:sz w:val="19"/>
+              </w:rPr>
+              <w:t>The English Verb System I–II</w:t>
+            </w:r>
+          </w:p>
+        </w:tc>
+        <w:tc>
+          <w:tcPr>
+            <w:tcW w:type="dxa" w:w="3402"/>
+            <w:shd w:val="clear" w:color="auto" w:fill="FBF2D0"/>
+          </w:tcPr>
+          <w:p>
+            <w:r>
+              <w:rPr>
+                <w:b/>
+                <w:i w:val="0"/>
+                <w:color w:val="81552E"/>
+                <w:sz w:val="19"/>
+              </w:rPr>
+              <w:t>S11–S12</w:t>
+            </w:r>
+          </w:p>
+        </w:tc>
+      </w:tr>
+      <w:tr>
+        <w:tc>
+          <w:tcPr>
+            <w:tcW w:type="dxa" w:w="6009"/>
+          </w:tcPr>
+          <w:p>
+            <w:r>
+              <w:rPr>
+                <w:b w:val="0"/>
+                <w:i w:val="0"/>
+                <w:sz w:val="19"/>
+              </w:rPr>
+              <w:t>Questions &amp; Word Order</w:t>
+            </w:r>
+          </w:p>
+        </w:tc>
+        <w:tc>
+          <w:tcPr>
+            <w:tcW w:type="dxa" w:w="3402"/>
+            <w:shd w:val="clear" w:color="auto" w:fill="FBF2D0"/>
+          </w:tcPr>
+          <w:p>
+            <w:r>
+              <w:rPr>
+                <w:b/>
+                <w:i w:val="0"/>
+                <w:color w:val="81552E"/>
+                <w:sz w:val="19"/>
+              </w:rPr>
+              <w:t>S13</w:t>
+            </w:r>
+          </w:p>
+        </w:tc>
+      </w:tr>
+      <w:tr>
+        <w:tc>
+          <w:tcPr>
+            <w:tcW w:type="dxa" w:w="6009"/>
+          </w:tcPr>
+          <w:p>
+            <w:r>
+              <w:rPr>
+                <w:b w:val="0"/>
+                <w:i w:val="0"/>
+                <w:sz w:val="19"/>
+              </w:rPr>
+              <w:t>Modals for Professional Communication</w:t>
+            </w:r>
+          </w:p>
+        </w:tc>
+        <w:tc>
+          <w:tcPr>
+            <w:tcW w:type="dxa" w:w="3402"/>
+            <w:shd w:val="clear" w:color="auto" w:fill="FBF2D0"/>
+          </w:tcPr>
+          <w:p>
+            <w:r>
+              <w:rPr>
+                <w:b/>
+                <w:i w:val="0"/>
+                <w:color w:val="81552E"/>
+                <w:sz w:val="19"/>
+              </w:rPr>
+              <w:t>S14</w:t>
+            </w:r>
+          </w:p>
+        </w:tc>
+      </w:tr>
+      <w:tr>
+        <w:tc>
+          <w:tcPr>
+            <w:tcW w:type="dxa" w:w="6009"/>
+          </w:tcPr>
+          <w:p>
+            <w:r>
+              <w:rPr>
+                <w:b w:val="0"/>
+                <w:i w:val="0"/>
+                <w:sz w:val="19"/>
+              </w:rPr>
+              <w:t>Causes, Conditions &amp; Consequences</w:t>
+            </w:r>
+          </w:p>
+        </w:tc>
+        <w:tc>
+          <w:tcPr>
+            <w:tcW w:type="dxa" w:w="3402"/>
+            <w:shd w:val="clear" w:color="auto" w:fill="FBF2D0"/>
+          </w:tcPr>
+          <w:p>
+            <w:r>
+              <w:rPr>
+                <w:b/>
+                <w:i w:val="0"/>
+                <w:color w:val="81552E"/>
+                <w:sz w:val="19"/>
+              </w:rPr>
+              <w:t>S15</w:t>
+            </w:r>
+          </w:p>
+        </w:tc>
+      </w:tr>
+      <w:tr>
+        <w:tc>
+          <w:tcPr>
+            <w:tcW w:type="dxa" w:w="6009"/>
+          </w:tcPr>
+          <w:p>
+            <w:r>
+              <w:rPr>
+                <w:b w:val="0"/>
+                <w:i w:val="0"/>
+                <w:sz w:val="19"/>
+              </w:rPr>
+              <w:t>High-Frequency Precision Patterns · Precision Library</w:t>
+            </w:r>
+          </w:p>
+        </w:tc>
+        <w:tc>
+          <w:tcPr>
+            <w:tcW w:type="dxa" w:w="3402"/>
+            <w:shd w:val="clear" w:color="auto" w:fill="FBF2D0"/>
+          </w:tcPr>
+          <w:p>
+            <w:r>
+              <w:rPr>
+                <w:b/>
+                <w:i w:val="0"/>
+                <w:color w:val="81552E"/>
+                <w:sz w:val="19"/>
+              </w:rPr>
+              <w:t>S15–S16 · antes si un patrón bloquea</w:t>
+            </w:r>
+          </w:p>
+        </w:tc>
+      </w:tr>
+      <w:tr>
+        <w:tc>
+          <w:tcPr>
+            <w:tcW w:type="dxa" w:w="6009"/>
+          </w:tcPr>
+          <w:p>
+            <w:r>
+              <w:rPr>
+                <w:b w:val="0"/>
+                <w:i w:val="0"/>
+                <w:sz w:val="19"/>
+              </w:rPr>
+              <w:t>How English Really Sounds · Train Your Ear</w:t>
+            </w:r>
+          </w:p>
+        </w:tc>
+        <w:tc>
+          <w:tcPr>
+            <w:tcW w:type="dxa" w:w="3402"/>
+            <w:shd w:val="clear" w:color="auto" w:fill="FBF2D0"/>
+          </w:tcPr>
+          <w:p>
+            <w:r>
+              <w:rPr>
+                <w:b/>
+                <w:i w:val="0"/>
+                <w:color w:val="81552E"/>
+                <w:sz w:val="19"/>
+              </w:rPr>
+              <w:t>S17</w:t>
+            </w:r>
+          </w:p>
+        </w:tc>
+      </w:tr>
+      <w:tr>
+        <w:tc>
+          <w:tcPr>
+            <w:tcW w:type="dxa" w:w="6009"/>
+          </w:tcPr>
+          <w:p>
+            <w:r>
+              <w:rPr>
+                <w:b w:val="0"/>
+                <w:i w:val="0"/>
+                <w:sz w:val="19"/>
+              </w:rPr>
+              <w:t>Pronunciation for Intelligibility · Shadowing</w:t>
+            </w:r>
+          </w:p>
+        </w:tc>
+        <w:tc>
+          <w:tcPr>
+            <w:tcW w:type="dxa" w:w="3402"/>
+            <w:shd w:val="clear" w:color="auto" w:fill="FBF2D0"/>
+          </w:tcPr>
+          <w:p>
+            <w:r>
+              <w:rPr>
+                <w:b/>
+                <w:i w:val="0"/>
+                <w:color w:val="81552E"/>
+                <w:sz w:val="19"/>
+              </w:rPr>
+              <w:t>S18</w:t>
+            </w:r>
+          </w:p>
+        </w:tc>
+      </w:tr>
+      <w:tr>
+        <w:tc>
+          <w:tcPr>
+            <w:tcW w:type="dxa" w:w="6009"/>
+          </w:tcPr>
+          <w:p>
+            <w:r>
+              <w:rPr>
+                <w:b w:val="0"/>
+                <w:i w:val="0"/>
+                <w:sz w:val="19"/>
+              </w:rPr>
+              <w:t>Listening &amp; Pronunciation Practice Library</w:t>
+            </w:r>
+          </w:p>
+        </w:tc>
+        <w:tc>
+          <w:tcPr>
+            <w:tcW w:type="dxa" w:w="3402"/>
+            <w:shd w:val="clear" w:color="auto" w:fill="FBF2D0"/>
+          </w:tcPr>
+          <w:p>
+            <w:r>
+              <w:rPr>
+                <w:b/>
+                <w:i w:val="0"/>
+                <w:color w:val="81552E"/>
+                <w:sz w:val="19"/>
+              </w:rPr>
+              <w:t>S17–S19 · antes si hace falta</w:t>
+            </w:r>
+          </w:p>
+        </w:tc>
+      </w:tr>
+      <w:tr>
+        <w:tc>
+          <w:tcPr>
+            <w:tcW w:type="dxa" w:w="6009"/>
+          </w:tcPr>
+          <w:p>
+            <w:r>
+              <w:rPr>
+                <w:b w:val="0"/>
+                <w:i w:val="0"/>
+                <w:sz w:val="19"/>
+              </w:rPr>
+              <w:t>Integración final · comparación con el Starting Point · autonomía</w:t>
+            </w:r>
+          </w:p>
+        </w:tc>
+        <w:tc>
+          <w:tcPr>
+            <w:tcW w:type="dxa" w:w="3402"/>
+            <w:shd w:val="clear" w:color="auto" w:fill="FBF2D0"/>
+          </w:tcPr>
+          <w:p>
+            <w:r>
+              <w:rPr>
+                <w:b/>
+                <w:i w:val="0"/>
+                <w:color w:val="81552E"/>
+                <w:sz w:val="19"/>
+              </w:rPr>
+              <w:t>S19–S20</w:t>
+            </w:r>
+          </w:p>
+        </w:tc>
+      </w:tr>
+    </w:tbl>
+    <w:p>
+      <w:pPr>
+        <w:spacing w:before="280"/>
+      </w:pPr>
+      <w:r>
+        <w:rPr>
+          <w:rFonts w:ascii="Source Serif Pro" w:hAnsi="Source Serif Pro" w:eastAsia="Source Serif Pro"/>
+          <w:b/>
+          <w:i w:val="0"/>
+          <w:color w:val="81552E"/>
+          <w:sz w:val="32"/>
+        </w:rPr>
+        <w:t>Tracks transversales</w:t>
+      </w:r>
+    </w:p>
+    <w:tbl>
+      <w:tblPr>
+        <w:tblW w:type="auto" w:w="0"/>
+        <w:tblBorders>
+          <w:top w:val="single" w:sz="4" w:color="EDE5CC"/>
+          <w:left w:val="single" w:sz="4" w:color="EDE5CC"/>
+          <w:bottom w:val="single" w:sz="4" w:color="EDE5CC"/>
+          <w:right w:val="single" w:sz="4" w:color="EDE5CC"/>
+          <w:insideH w:val="single" w:sz="4" w:color="EDE5CC"/>
+          <w:insideV w:val="single" w:sz="4" w:color="EDE5CC"/>
+        </w:tblBorders>
+        <w:tblLayout w:type="fixed"/>
+        <w:tblLook w:firstColumn="1" w:firstRow="1" w:lastColumn="0" w:lastRow="0" w:noHBand="0" w:noVBand="1" w:val="04A0"/>
+      </w:tblPr>
+      <w:tblGrid>
+        <w:gridCol w:w="2381"/>
+        <w:gridCol w:w="7030"/>
+      </w:tblGrid>
+      <w:tr>
+        <w:tc>
+          <w:tcPr>
+            <w:tcW w:type="dxa" w:w="2381"/>
+            <w:shd w:val="clear" w:color="auto" w:fill="FBF2D0"/>
+          </w:tcPr>
+          <w:p>
+            <w:r>
+              <w:rPr>
+                <w:b/>
+                <w:i w:val="0"/>
+                <w:color w:val="81552E"/>
+                <w:sz w:val="19"/>
+              </w:rPr>
+              <w:t>Precisión</w:t>
+            </w:r>
+          </w:p>
+        </w:tc>
+        <w:tc>
+          <w:tcPr>
+            <w:tcW w:type="dxa" w:w="7030"/>
+          </w:tcPr>
+          <w:p>
+            <w:r>
+              <w:rPr>
+                <w:b w:val="0"/>
+                <w:i w:val="0"/>
+                <w:sz w:val="19"/>
+              </w:rPr>
+              <w:t>Se observa desde la sesión 3 con el Error Radar. Polish la trabaja de forma intensiva. Si un patrón bloquea antes, se interviene antes.</w:t>
+            </w:r>
+          </w:p>
+        </w:tc>
+      </w:tr>
+      <w:tr>
+        <w:tc>
+          <w:tcPr>
+            <w:tcW w:type="dxa" w:w="2381"/>
+            <w:shd w:val="clear" w:color="auto" w:fill="FBF2D0"/>
+          </w:tcPr>
+          <w:p>
+            <w:r>
+              <w:rPr>
+                <w:b/>
+                <w:i w:val="0"/>
+                <w:color w:val="81552E"/>
+                <w:sz w:val="19"/>
+              </w:rPr>
+              <w:t>Pronunciación</w:t>
+            </w:r>
+          </w:p>
+        </w:tc>
+        <w:tc>
+          <w:tcPr>
+            <w:tcW w:type="dxa" w:w="7030"/>
+          </w:tcPr>
+          <w:p>
+            <w:r>
+              <w:rPr>
+                <w:b w:val="0"/>
+                <w:i w:val="0"/>
+                <w:sz w:val="19"/>
+              </w:rPr>
+              <w:t>Desde el inicio se corrige solo cuando afecta la comprensión. Understand &amp; Be Understood la trabaja de forma intensiva.</w:t>
+            </w:r>
+          </w:p>
+        </w:tc>
+      </w:tr>
+      <w:tr>
+        <w:tc>
+          <w:tcPr>
+            <w:tcW w:type="dxa" w:w="2381"/>
+            <w:shd w:val="clear" w:color="auto" w:fill="FBF2D0"/>
+          </w:tcPr>
+          <w:p>
+            <w:r>
+              <w:rPr>
+                <w:b/>
+                <w:i w:val="0"/>
+                <w:color w:val="81552E"/>
+                <w:sz w:val="19"/>
+              </w:rPr>
+              <w:t>Listening</w:t>
+            </w:r>
+          </w:p>
+        </w:tc>
+        <w:tc>
+          <w:tcPr>
+            <w:tcW w:type="dxa" w:w="7030"/>
+          </w:tcPr>
+          <w:p>
+            <w:r>
+              <w:rPr>
+                <w:b w:val="0"/>
+                <w:i w:val="0"/>
+                <w:sz w:val="19"/>
+              </w:rPr>
+              <w:t>Se entrena cuando la situación real lo pide. Understand &amp; Be Understood lo sistematiza.</w:t>
+            </w:r>
+          </w:p>
+        </w:tc>
+      </w:tr>
+      <w:tr>
+        <w:tc>
+          <w:tcPr>
+            <w:tcW w:type="dxa" w:w="2381"/>
+            <w:shd w:val="clear" w:color="auto" w:fill="FBF2D0"/>
+          </w:tcPr>
+          <w:p>
+            <w:r>
+              <w:rPr>
+                <w:b/>
+                <w:i w:val="0"/>
+                <w:color w:val="81552E"/>
+                <w:sz w:val="19"/>
+              </w:rPr>
+              <w:t>Situaciones reales</w:t>
+            </w:r>
+          </w:p>
+        </w:tc>
+        <w:tc>
+          <w:tcPr>
+            <w:tcW w:type="dxa" w:w="7030"/>
+          </w:tcPr>
+          <w:p>
+            <w:r>
+              <w:rPr>
+                <w:b w:val="0"/>
+                <w:i w:val="0"/>
+                <w:sz w:val="19"/>
+              </w:rPr>
+              <w:t>Cada sesión usa una situación o material real. Las Workplace Guides entran como escenario, no como un curso paralelo.</w:t>
+            </w:r>
+          </w:p>
+        </w:tc>
+      </w:tr>
+      <w:tr>
+        <w:tc>
+          <w:tcPr>
+            <w:tcW w:type="dxa" w:w="2381"/>
+            <w:shd w:val="clear" w:color="auto" w:fill="FBF2D0"/>
+          </w:tcPr>
+          <w:p>
+            <w:r>
+              <w:rPr>
+                <w:b/>
+                <w:i w:val="0"/>
+                <w:color w:val="81552E"/>
+                <w:sz w:val="19"/>
+              </w:rPr>
+              <w:t>Evidencia y retry</w:t>
+            </w:r>
+          </w:p>
+        </w:tc>
+        <w:tc>
+          <w:tcPr>
+            <w:tcW w:type="dxa" w:w="7030"/>
+          </w:tcPr>
+          <w:p>
+            <w:r>
+              <w:rPr>
+                <w:b w:val="0"/>
+                <w:i w:val="0"/>
+                <w:sz w:val="19"/>
+              </w:rPr>
+              <w:t>Toda sesión tiene producción, feedback, retry y evidencia. Ver un video no cuenta como progreso por sí solo.</w:t>
+            </w:r>
+          </w:p>
+        </w:tc>
+      </w:tr>
+    </w:tbl>
+    <w:p>
+      <w:pPr>
+        <w:spacing w:before="280"/>
+      </w:pPr>
+      <w:r>
+        <w:rPr>
+          <w:rFonts w:ascii="Source Serif Pro" w:hAnsi="Source Serif Pro" w:eastAsia="Source Serif Pro"/>
+          <w:b/>
+          <w:i w:val="0"/>
+          <w:color w:val="81552E"/>
+          <w:sz w:val="32"/>
+        </w:rPr>
+        <w:t>Criterio de calidad final</w:t>
+      </w:r>
+    </w:p>
+    <w:p>
+      <w:r>
+        <w:rPr>
+          <w:b w:val="0"/>
+          <w:i w:val="0"/>
+        </w:rPr>
+        <w:t>Una alumna que completa las 20 sesiones atravesó el método completo aunque no haya visto todos los videos. La plataforma acelera y profundiza; las sesiones 1:1 garantizan la transformación.</w:t>
       </w:r>
     </w:p>
     <w:sectPr>

</xml_diff>

<commit_message>
Master Delivery Map: 4 etapas + extremos, excepción a la regla de avance, sesión vs skill
Co-Authored-By: Claude Opus 5.5 <noreply@anthropic.com>
Claude-Session: https://claude.ai/code/session_01PSmnUj1LvutfXzpzQBGsxa
</commit_message>
<xml_diff>
--- a/onboarding/recursos/Master_Delivery_Map_20_sesiones.docx
+++ b/onboarding/recursos/Master_Delivery_Map_20_sesiones.docx
@@ -500,7 +500,7 @@
                 <w:color w:val="81552E"/>
                 <w:sz w:val="18"/>
               </w:rPr>
-              <w:t xml:space="preserve">REGLA  </w:t>
+              <w:t xml:space="preserve">REGLA DE AVANCE  </w:t>
             </w:r>
             <w:r>
               <w:rPr>
@@ -508,7 +508,7 @@
                 <w:i w:val="0"/>
                 <w:sz w:val="20"/>
               </w:rPr>
-              <w:t>Si una alumna todavía no tiene autonomía en una habilidad, la sesión siguiente introduce igual la nueva, y la pendiente sigue como track transversal. Así nadie queda sin pasar por una habilidad esencial y el recorrido no se corre.</w:t>
+              <w:t>Si una alumna todavía no tiene autonomía en una habilidad, la sesión siguiente introduce igual la nueva y la pendiente queda como carry-over, trabajada de forma transversal. Así nadie queda sin pasar por una habilidad esencial y el calendario no se corre.</w:t>
             </w:r>
           </w:p>
         </w:tc>
@@ -519,6 +519,234 @@
         <w:spacing w:after="0"/>
       </w:pPr>
     </w:p>
+    <w:tbl>
+      <w:tblPr>
+        <w:tblW w:type="auto" w:w="0"/>
+        <w:tblBorders>
+          <w:top w:val="single" w:sz="4" w:color="FBF2D0"/>
+          <w:left w:val="single" w:sz="4" w:color="FBF2D0"/>
+          <w:bottom w:val="single" w:sz="4" w:color="FBF2D0"/>
+          <w:right w:val="single" w:sz="4" w:color="FBF2D0"/>
+          <w:insideH w:val="single" w:sz="4" w:color="FBF2D0"/>
+          <w:insideV w:val="single" w:sz="4" w:color="FBF2D0"/>
+        </w:tblBorders>
+        <w:tblLook w:firstColumn="1" w:firstRow="1" w:lastColumn="0" w:lastRow="0" w:noHBand="0" w:noVBand="1" w:val="04A0"/>
+      </w:tblPr>
+      <w:tblGrid>
+        <w:gridCol w:w="9746"/>
+      </w:tblGrid>
+      <w:tr>
+        <w:tc>
+          <w:tcPr>
+            <w:tcW w:type="dxa" w:w="9746"/>
+            <w:shd w:val="clear" w:color="auto" w:fill="FBF2D0"/>
+          </w:tcPr>
+          <w:p>
+            <w:r>
+              <w:rPr>
+                <w:b/>
+                <w:i w:val="0"/>
+                <w:color w:val="81552E"/>
+                <w:sz w:val="18"/>
+              </w:rPr>
+              <w:t xml:space="preserve">EXCEPCIÓN  </w:t>
+            </w:r>
+            <w:r>
+              <w:rPr>
+                <w:b w:val="0"/>
+                <w:i w:val="0"/>
+                <w:sz w:val="20"/>
+              </w:rPr>
+              <w:t>Se avanza salvo que el gap anterior impida materialmente trabajar la habilidad siguiente. Ejemplo: si todavía no logra un primer intento espontáneo mínimamente funcional, no se da por recorrida Activate solo porque llegó la semana 5. En ese caso se repite el foco de la sesión anterior, con la misma evidencia como meta, y se deja registrado el motivo.</w:t>
+            </w:r>
+          </w:p>
+        </w:tc>
+      </w:tr>
+    </w:tbl>
+    <w:p>
+      <w:pPr>
+        <w:spacing w:after="0"/>
+      </w:pPr>
+    </w:p>
+    <w:p>
+      <w:pPr>
+        <w:spacing w:before="160" w:after="40"/>
+      </w:pPr>
+      <w:r>
+        <w:rPr>
+          <w:b/>
+          <w:i w:val="0"/>
+          <w:color w:val="C68C6C"/>
+          <w:sz w:val="17"/>
+        </w:rPr>
+        <w:t>SESIÓN RECORRIDA NO ES LO MISMO QUE SKILL CONSOLIDADA</w:t>
+      </w:r>
+    </w:p>
+    <w:p>
+      <w:r>
+        <w:rPr>
+          <w:b w:val="0"/>
+          <w:i w:val="0"/>
+        </w:rPr>
+        <w:t>Que una sesión esté completada significa que la alumna pasó por esa habilidad, no que la domina. Por eso cada sesión se registra con cuatro datos separados:</w:t>
+      </w:r>
+    </w:p>
+    <w:tbl>
+      <w:tblPr>
+        <w:tblW w:type="auto" w:w="0"/>
+        <w:tblBorders>
+          <w:top w:val="single" w:sz="4" w:color="EDE5CC"/>
+          <w:left w:val="single" w:sz="4" w:color="EDE5CC"/>
+          <w:bottom w:val="single" w:sz="4" w:color="EDE5CC"/>
+          <w:right w:val="single" w:sz="4" w:color="EDE5CC"/>
+          <w:insideH w:val="single" w:sz="4" w:color="EDE5CC"/>
+          <w:insideV w:val="single" w:sz="4" w:color="EDE5CC"/>
+        </w:tblBorders>
+        <w:tblLayout w:type="fixed"/>
+        <w:tblLook w:firstColumn="1" w:firstRow="1" w:lastColumn="0" w:lastRow="0" w:noHBand="0" w:noVBand="1" w:val="04A0"/>
+      </w:tblPr>
+      <w:tblGrid>
+        <w:gridCol w:w="2381"/>
+        <w:gridCol w:w="7030"/>
+      </w:tblGrid>
+      <w:tr>
+        <w:tc>
+          <w:tcPr>
+            <w:tcW w:type="dxa" w:w="2381"/>
+            <w:shd w:val="clear" w:color="auto" w:fill="FBF2D0"/>
+          </w:tcPr>
+          <w:p>
+            <w:r>
+              <w:rPr>
+                <w:b/>
+                <w:i w:val="0"/>
+                <w:color w:val="81552E"/>
+                <w:sz w:val="19"/>
+              </w:rPr>
+              <w:t>Estado de la sesión</w:t>
+            </w:r>
+          </w:p>
+        </w:tc>
+        <w:tc>
+          <w:tcPr>
+            <w:tcW w:type="dxa" w:w="7030"/>
+          </w:tcPr>
+          <w:p>
+            <w:r>
+              <w:rPr>
+                <w:b w:val="0"/>
+                <w:i w:val="0"/>
+                <w:sz w:val="19"/>
+              </w:rPr>
+              <w:t>Pending / Completed</w:t>
+            </w:r>
+          </w:p>
+        </w:tc>
+      </w:tr>
+      <w:tr>
+        <w:tc>
+          <w:tcPr>
+            <w:tcW w:type="dxa" w:w="2381"/>
+            <w:shd w:val="clear" w:color="auto" w:fill="FBF2D0"/>
+          </w:tcPr>
+          <w:p>
+            <w:r>
+              <w:rPr>
+                <w:b/>
+                <w:i w:val="0"/>
+                <w:color w:val="81552E"/>
+                <w:sz w:val="19"/>
+              </w:rPr>
+              <w:t>Estado de la skill</w:t>
+            </w:r>
+          </w:p>
+        </w:tc>
+        <w:tc>
+          <w:tcPr>
+            <w:tcW w:type="dxa" w:w="7030"/>
+          </w:tcPr>
+          <w:p>
+            <w:r>
+              <w:rPr>
+                <w:b w:val="0"/>
+                <w:i w:val="0"/>
+                <w:sz w:val="19"/>
+              </w:rPr>
+              <w:t>Introduced (la vio y la probó) · In Progress (aparece con ayuda o de forma irregular) · Stable (la evidencia observable aparece en producción espontánea, sin ayuda, en al menos dos ocasiones)</w:t>
+            </w:r>
+          </w:p>
+        </w:tc>
+      </w:tr>
+      <w:tr>
+        <w:tc>
+          <w:tcPr>
+            <w:tcW w:type="dxa" w:w="2381"/>
+            <w:shd w:val="clear" w:color="auto" w:fill="FBF2D0"/>
+          </w:tcPr>
+          <w:p>
+            <w:r>
+              <w:rPr>
+                <w:b/>
+                <w:i w:val="0"/>
+                <w:color w:val="81552E"/>
+                <w:sz w:val="19"/>
+              </w:rPr>
+              <w:t>Evidencia</w:t>
+            </w:r>
+          </w:p>
+        </w:tc>
+        <w:tc>
+          <w:tcPr>
+            <w:tcW w:type="dxa" w:w="7030"/>
+          </w:tcPr>
+          <w:p>
+            <w:r>
+              <w:rPr>
+                <w:b w:val="0"/>
+                <w:i w:val="0"/>
+                <w:sz w:val="19"/>
+              </w:rPr>
+              <w:t>Qué observaste: una frase concreta, no una opinión.</w:t>
+            </w:r>
+          </w:p>
+        </w:tc>
+      </w:tr>
+      <w:tr>
+        <w:tc>
+          <w:tcPr>
+            <w:tcW w:type="dxa" w:w="2381"/>
+            <w:shd w:val="clear" w:color="auto" w:fill="FBF2D0"/>
+          </w:tcPr>
+          <w:p>
+            <w:r>
+              <w:rPr>
+                <w:b/>
+                <w:i w:val="0"/>
+                <w:color w:val="81552E"/>
+                <w:sz w:val="19"/>
+              </w:rPr>
+              <w:t>Carry-over</w:t>
+            </w:r>
+          </w:p>
+        </w:tc>
+        <w:tc>
+          <w:tcPr>
+            <w:tcW w:type="dxa" w:w="7030"/>
+          </w:tcPr>
+          <w:p>
+            <w:r>
+              <w:rPr>
+                <w:b w:val="0"/>
+                <w:i w:val="0"/>
+                <w:sz w:val="19"/>
+              </w:rPr>
+              <w:t>Sí / No. Si es «sí», qué se arrastra a las próximas sesiones como foco transversal.</w:t>
+            </w:r>
+          </w:p>
+        </w:tc>
+      </w:tr>
+    </w:tbl>
+    <w:p/>
     <w:p>
       <w:pPr>
         <w:spacing w:before="160" w:after="40"/>
@@ -1096,7 +1324,7 @@
         <w:pStyle w:val="ListBullet"/>
       </w:pPr>
       <w:r>
-        <w:t>El recorrido en 6 etapas, con el recurso «Tu recorrido AT WORK».</w:t>
+        <w:t>El recorrido completo de 20 semanas: onboarding + las 4 etapas del método + offboarding, con el recurso «Tu recorrido AT WORK».</w:t>
       </w:r>
     </w:p>
     <w:p>
@@ -8683,6 +8911,79 @@
         </w:tc>
       </w:tr>
     </w:tbl>
+    <w:p>
+      <w:pPr>
+        <w:spacing w:before="280"/>
+      </w:pPr>
+      <w:r>
+        <w:rPr>
+          <w:rFonts w:ascii="Source Serif Pro" w:hAnsi="Source Serif Pro" w:eastAsia="Source Serif Pro"/>
+          <w:b/>
+          <w:i w:val="0"/>
+          <w:color w:val="81552E"/>
+          <w:sz w:val="32"/>
+        </w:rPr>
+        <w:t>Cómo se va a ver en Notion</w:t>
+      </w:r>
+    </w:p>
+    <w:p>
+      <w:r>
+        <w:rPr>
+          <w:b w:val="0"/>
+          <w:i w:val="0"/>
+        </w:rPr>
+        <w:t>Master Delivery Map: 20 registros estándar, uno por sesión, con lo fijo (etapa, Core Skill, resultado, evidencia, microenseñanza).</w:t>
+      </w:r>
+    </w:p>
+    <w:p>
+      <w:r>
+        <w:rPr>
+          <w:b w:val="0"/>
+          <w:i w:val="0"/>
+        </w:rPr>
+        <w:t>Student Delivery Tracker: cada alumna tiene sus 20 sesiones, relacionadas con el Master Map, con estado de la sesión, estado de la skill, evidencia y carry-over. La vista por alumna muestra, por ejemplo:</w:t>
+      </w:r>
+    </w:p>
+    <w:tbl>
+      <w:tblPr>
+        <w:tblW w:type="auto" w:w="0"/>
+        <w:tblBorders>
+          <w:top w:val="single" w:sz="4" w:color="FBF2D0"/>
+          <w:left w:val="single" w:sz="4" w:color="FBF2D0"/>
+          <w:bottom w:val="single" w:sz="4" w:color="FBF2D0"/>
+          <w:right w:val="single" w:sz="4" w:color="FBF2D0"/>
+          <w:insideH w:val="single" w:sz="4" w:color="FBF2D0"/>
+          <w:insideV w:val="single" w:sz="4" w:color="FBF2D0"/>
+        </w:tblBorders>
+        <w:tblLook w:firstColumn="1" w:firstRow="1" w:lastColumn="0" w:lastRow="0" w:noHBand="0" w:noVBand="1" w:val="04A0"/>
+      </w:tblPr>
+      <w:tblGrid>
+        <w:gridCol w:w="9746"/>
+      </w:tblGrid>
+      <w:tr>
+        <w:tc>
+          <w:tcPr>
+            <w:tcW w:type="dxa" w:w="9746"/>
+            <w:shd w:val="clear" w:color="auto" w:fill="FBF2D0"/>
+          </w:tcPr>
+          <w:p>
+            <w:r>
+              <w:rPr>
+                <w:b w:val="0"/>
+                <w:i w:val="0"/>
+                <w:sz w:val="20"/>
+              </w:rPr>
+              <w:t>Belén — 8/20 · Etapa actual: Communicate in Real Time · Última completada: S8 Gain Time + Repair &amp; Continue · Skill: In Progress · Carry-over: recuperar el hilo · Próxima: S9 Manage the Interaction</w:t>
+            </w:r>
+          </w:p>
+        </w:tc>
+      </w:tr>
+    </w:tbl>
+    <w:p>
+      <w:pPr>
+        <w:spacing w:after="0"/>
+      </w:pPr>
+    </w:p>
     <w:p>
       <w:pPr>
         <w:spacing w:before="280"/>

</xml_diff>

<commit_message>
Master Delivery Map final: definición de Stable y calendario fijo con carry-over
Co-Authored-By: Claude Opus 5.5 <noreply@anthropic.com>
Claude-Session: https://claude.ai/code/session_01PSmnUj1LvutfXzpzQBGsxa
</commit_message>
<xml_diff>
--- a/onboarding/recursos/Master_Delivery_Map_20_sesiones.docx
+++ b/onboarding/recursos/Master_Delivery_Map_20_sesiones.docx
@@ -508,7 +508,7 @@
                 <w:i w:val="0"/>
                 <w:sz w:val="20"/>
               </w:rPr>
-              <w:t>Si una alumna todavía no tiene autonomía en una habilidad, la sesión siguiente introduce igual la nueva y la pendiente queda como carry-over, trabajada de forma transversal. Así nadie queda sin pasar por una habilidad esencial y el calendario no se corre.</w:t>
+              <w:t>El calendario no se mueve: las 20 sesiones mantienen su número y su etapa. Stable no es requisito para avanzar. El recorrido avanza y el aprendizaje tiene carry-over.</w:t>
             </w:r>
           </w:p>
         </w:tc>
@@ -549,7 +549,7 @@
                 <w:color w:val="81552E"/>
                 <w:sz w:val="18"/>
               </w:rPr>
-              <w:t xml:space="preserve">EXCEPCIÓN  </w:t>
+              <w:t xml:space="preserve">SI UNA SKILL BLOQUEA  </w:t>
             </w:r>
             <w:r>
               <w:rPr>
@@ -557,7 +557,7 @@
                 <w:i w:val="0"/>
                 <w:sz w:val="20"/>
               </w:rPr>
-              <w:t>Se avanza salvo que el gap anterior impida materialmente trabajar la habilidad siguiente. Ejemplo: si todavía no logra un primer intento espontáneo mínimamente funcional, no se da por recorrida Activate solo porque llegó la semana 5. En ese caso se repite el foco de la sesión anterior, con la misma evidencia como meta, y se deja registrado el motivo.</w:t>
+              <w:t>Si la skill anterior dificulta significativamente la nueva, la sesión mantiene su número y su etapa, pero: la skill anterior sigue como foco prioritario (carry-over); la nueva se introduce en el nivel mínimo posible; se registra el estado real de ambas; y la pendiente sigue apareciendo de forma transversal en las sesiones siguientes.</w:t>
             </w:r>
           </w:p>
         </w:tc>
@@ -567,6 +567,66 @@
       <w:pPr>
         <w:spacing w:after="0"/>
       </w:pPr>
+    </w:p>
+    <w:tbl>
+      <w:tblPr>
+        <w:tblW w:type="auto" w:w="0"/>
+        <w:tblBorders>
+          <w:top w:val="single" w:sz="4" w:color="FBF2D0"/>
+          <w:left w:val="single" w:sz="4" w:color="FBF2D0"/>
+          <w:bottom w:val="single" w:sz="4" w:color="FBF2D0"/>
+          <w:right w:val="single" w:sz="4" w:color="FBF2D0"/>
+          <w:insideH w:val="single" w:sz="4" w:color="FBF2D0"/>
+          <w:insideV w:val="single" w:sz="4" w:color="FBF2D0"/>
+        </w:tblBorders>
+        <w:tblLook w:firstColumn="1" w:firstRow="1" w:lastColumn="0" w:lastRow="0" w:noHBand="0" w:noVBand="1" w:val="04A0"/>
+      </w:tblPr>
+      <w:tblGrid>
+        <w:gridCol w:w="9746"/>
+      </w:tblGrid>
+      <w:tr>
+        <w:tc>
+          <w:tcPr>
+            <w:tcW w:type="dxa" w:w="9746"/>
+            <w:shd w:val="clear" w:color="auto" w:fill="FBF2D0"/>
+          </w:tcPr>
+          <w:p>
+            <w:r>
+              <w:rPr>
+                <w:b/>
+                <w:i w:val="0"/>
+                <w:color w:val="81552E"/>
+                <w:sz w:val="18"/>
+              </w:rPr>
+              <w:t xml:space="preserve">CASO EXCEPCIONAL  </w:t>
+            </w:r>
+            <w:r>
+              <w:rPr>
+                <w:b w:val="0"/>
+                <w:i w:val="0"/>
+                <w:sz w:val="20"/>
+              </w:rPr>
+              <w:t>Solo si el gap anterior hace materialmente imposible trabajar la nueva skill, esa sesión se dedica al gap bloqueante y la nueva queda como «Not yet introduced», para incorporarla en la siguiente oportunidad compatible. El calendario de 20 sesiones no cambia.</w:t>
+            </w:r>
+          </w:p>
+        </w:tc>
+      </w:tr>
+    </w:tbl>
+    <w:p>
+      <w:pPr>
+        <w:spacing w:after="0"/>
+      </w:pPr>
+    </w:p>
+    <w:p>
+      <w:r>
+        <w:rPr>
+          <w:b w:val="0"/>
+          <w:i/>
+          <w:color w:val="8A6A55"/>
+          <w:sz w:val="19"/>
+        </w:rPr>
+        <w:t>Se evitan así dos extremos: «no dominó S4, entonces nunca llegamos a S5» y «llegó la semana 5, marco S4 completada aunque no pueda hacerlo».</w:t>
+      </w:r>
     </w:p>
     <w:p>
       <w:pPr>
@@ -672,7 +732,7 @@
                 <w:i w:val="0"/>
                 <w:sz w:val="19"/>
               </w:rPr>
-              <w:t>Introduced (la vio y la probó) · In Progress (aparece con ayuda o de forma irregular) · Stable (la evidencia observable aparece en producción espontánea, sin ayuda, en al menos dos ocasiones)</w:t>
+              <w:t>Not yet introduced (quedó pendiente por un gap bloqueante) · Introduced (la vio, la entendió y la probó) · In Progress (aparece con ayuda, prompting o de forma irregular) · Stable (aparece sola y de manera repetible: la evidencia observable aparece de forma espontánea, sin prompting ni ayuda directa, en al menos dos ocasiones separadas; idealmente una de ellas en una situación nueva, bajo presión o en una aplicación real de trabajo. Dos evidencias distintas, no dos repeticiones seguidas del mismo ejercicio)</w:t>
             </w:r>
           </w:p>
         </w:tc>
@@ -2339,7 +2399,7 @@
                 <w:i w:val="0"/>
                 <w:sz w:val="20"/>
               </w:rPr>
-              <w:t>Primer ciclo completo. Pregunta clave: ¿puede practicar sola entre sesiones? Si no, refuérzalo antes de avanzar a la etapa 2.</w:t>
+              <w:t>Primer ciclo completo. Pregunta clave: ¿puede practicar sola entre sesiones? Si no, queda como carry-over prioritario durante la etapa 2.</w:t>
             </w:r>
           </w:p>
         </w:tc>

</xml_diff>